<commit_message>
docs: update documentation for current project
</commit_message>
<xml_diff>
--- a/docs/Technical-Documentation.docx
+++ b/docs/Technical-Documentation.docx
@@ -621,33 +621,7 @@
         </w:rPr>
       </w:pPr>
       <w:r>
-        <w:rPr>
-          <w:rFonts w:cs="Times New Roman"/>
-          <w:b/>
-          <w:sz w:val="28"/>
-          <w:szCs w:val="28"/>
-        </w:rPr>
-        <w:t>HTTP API «</w:t>
-      </w:r>
-      <w:proofErr w:type="spellStart"/>
-      <w:r>
-        <w:rPr>
-          <w:rFonts w:cs="Times New Roman"/>
-          <w:b/>
-          <w:sz w:val="28"/>
-          <w:szCs w:val="28"/>
-        </w:rPr>
-        <w:t>Аукционы</w:t>
-      </w:r>
-      <w:proofErr w:type="spellEnd"/>
-      <w:r>
-        <w:rPr>
-          <w:rFonts w:cs="Times New Roman"/>
-          <w:b/>
-          <w:sz w:val="28"/>
-          <w:szCs w:val="28"/>
-        </w:rPr>
-        <w:t>»</w:t>
+        <w:t>Система «Аукционы»</w:t>
       </w:r>
     </w:p>
     <w:p>
@@ -662,49 +636,9 @@
         </w:rPr>
       </w:pPr>
       <w:r>
-        <w:rPr>
-          <w:rFonts w:cs="Times New Roman"/>
-          <w:sz w:val="28"/>
-          <w:szCs w:val="28"/>
-          <w:lang w:val="ru-RU"/>
-        </w:rPr>
         <w:t>техническое задание</w:t>
-      </w:r>
-      <w:r>
-        <w:rPr>
-          <w:rFonts w:cs="Times New Roman"/>
-          <w:sz w:val="28"/>
-          <w:szCs w:val="28"/>
-          <w:lang w:val="ru-RU"/>
-        </w:rPr>
         <w:br/>
-      </w:r>
-      <w:r>
-        <w:rPr>
-          <w:rFonts w:cs="Times New Roman"/>
-          <w:sz w:val="28"/>
-          <w:szCs w:val="28"/>
-          <w:lang w:val="ru-RU"/>
-        </w:rPr>
-        <w:br/>
-        <w:t>На 19</w:t>
-      </w:r>
-      <w:r>
-        <w:rPr>
-          <w:rFonts w:cs="Times New Roman"/>
-          <w:sz w:val="28"/>
-          <w:szCs w:val="28"/>
-          <w:lang w:val="ru-RU"/>
-        </w:rPr>
-        <w:t xml:space="preserve"> листах</w:t>
-      </w:r>
-      <w:r>
-        <w:rPr>
-          <w:rFonts w:cs="Times New Roman"/>
-          <w:sz w:val="28"/>
-          <w:szCs w:val="28"/>
-          <w:lang w:val="ru-RU"/>
-        </w:rPr>
+        <w:t>На 20 листах</w:t>
         <w:br/>
         <w:t>Действует с «16» сентября 2026 г.</w:t>
       </w:r>
@@ -3015,7 +2949,7 @@
                 <w:sz w:val="28"/>
                 <w:szCs w:val="28"/>
               </w:rPr>
-              <w:t>8</w:t>
+              <w:t>9</w:t>
             </w:r>
             <w:r>
               <w:rPr>
@@ -3112,7 +3046,7 @@
                 <w:sz w:val="28"/>
                 <w:szCs w:val="28"/>
               </w:rPr>
-              <w:t>8</w:t>
+              <w:t>9</w:t>
             </w:r>
             <w:r>
               <w:rPr>
@@ -3209,7 +3143,7 @@
                 <w:sz w:val="28"/>
                 <w:szCs w:val="28"/>
               </w:rPr>
-              <w:t>8</w:t>
+              <w:t>9</w:t>
             </w:r>
             <w:r>
               <w:rPr>
@@ -3597,7 +3531,7 @@
                 <w:sz w:val="28"/>
                 <w:szCs w:val="28"/>
               </w:rPr>
-              <w:t>9</w:t>
+              <w:t>10</w:t>
             </w:r>
             <w:r>
               <w:rPr>
@@ -3694,7 +3628,7 @@
                 <w:sz w:val="28"/>
                 <w:szCs w:val="28"/>
               </w:rPr>
-              <w:t>9</w:t>
+              <w:t>10</w:t>
             </w:r>
             <w:r>
               <w:rPr>
@@ -3791,7 +3725,7 @@
                 <w:sz w:val="28"/>
                 <w:szCs w:val="28"/>
               </w:rPr>
-              <w:t>11</w:t>
+              <w:t>12</w:t>
             </w:r>
             <w:r>
               <w:rPr>
@@ -3888,7 +3822,7 @@
                 <w:sz w:val="28"/>
                 <w:szCs w:val="28"/>
               </w:rPr>
-              <w:t>11</w:t>
+              <w:t>12</w:t>
             </w:r>
             <w:r>
               <w:rPr>
@@ -3985,7 +3919,7 @@
                 <w:sz w:val="28"/>
                 <w:szCs w:val="28"/>
               </w:rPr>
-              <w:t>11</w:t>
+              <w:t>12</w:t>
             </w:r>
             <w:r>
               <w:rPr>
@@ -4082,7 +4016,7 @@
                 <w:sz w:val="28"/>
                 <w:szCs w:val="28"/>
               </w:rPr>
-              <w:t>11</w:t>
+              <w:t>12</w:t>
             </w:r>
             <w:r>
               <w:rPr>
@@ -4179,7 +4113,7 @@
                 <w:sz w:val="28"/>
                 <w:szCs w:val="28"/>
               </w:rPr>
-              <w:t>11</w:t>
+              <w:t>12</w:t>
             </w:r>
             <w:r>
               <w:rPr>
@@ -4276,7 +4210,7 @@
                 <w:sz w:val="28"/>
                 <w:szCs w:val="28"/>
               </w:rPr>
-              <w:t>11</w:t>
+              <w:t>12</w:t>
             </w:r>
             <w:r>
               <w:rPr>
@@ -4373,7 +4307,7 @@
                 <w:sz w:val="28"/>
                 <w:szCs w:val="28"/>
               </w:rPr>
-              <w:t>11</w:t>
+              <w:t>13</w:t>
             </w:r>
             <w:r>
               <w:rPr>
@@ -4469,7 +4403,7 @@
                 <w:sz w:val="28"/>
                 <w:szCs w:val="28"/>
               </w:rPr>
-              <w:t>12</w:t>
+              <w:t>13</w:t>
             </w:r>
             <w:r>
               <w:rPr>
@@ -4565,7 +4499,7 @@
                 <w:sz w:val="28"/>
                 <w:szCs w:val="28"/>
               </w:rPr>
-              <w:t>12</w:t>
+              <w:t>14</w:t>
             </w:r>
             <w:r>
               <w:rPr>
@@ -4661,7 +4595,7 @@
                 <w:sz w:val="28"/>
                 <w:szCs w:val="28"/>
               </w:rPr>
-              <w:t>12</w:t>
+              <w:t>14</w:t>
             </w:r>
             <w:r>
               <w:rPr>
@@ -4758,7 +4692,7 @@
                 <w:sz w:val="28"/>
                 <w:szCs w:val="28"/>
               </w:rPr>
-              <w:t>13</w:t>
+              <w:t>14</w:t>
             </w:r>
             <w:r>
               <w:rPr>
@@ -4855,7 +4789,7 @@
                 <w:sz w:val="28"/>
                 <w:szCs w:val="28"/>
               </w:rPr>
-              <w:t>13</w:t>
+              <w:t>15</w:t>
             </w:r>
             <w:r>
               <w:rPr>
@@ -4952,7 +4886,7 @@
                 <w:sz w:val="28"/>
                 <w:szCs w:val="28"/>
               </w:rPr>
-              <w:t>13</w:t>
+              <w:t>15</w:t>
             </w:r>
             <w:r>
               <w:rPr>
@@ -5049,7 +4983,7 @@
                 <w:sz w:val="28"/>
                 <w:szCs w:val="28"/>
               </w:rPr>
-              <w:t>13</w:t>
+              <w:t>15</w:t>
             </w:r>
             <w:r>
               <w:rPr>
@@ -5146,7 +5080,7 @@
                 <w:sz w:val="28"/>
                 <w:szCs w:val="28"/>
               </w:rPr>
-              <w:t>14</w:t>
+              <w:t>16</w:t>
             </w:r>
             <w:r>
               <w:rPr>
@@ -5243,7 +5177,7 @@
                 <w:sz w:val="28"/>
                 <w:szCs w:val="28"/>
               </w:rPr>
-              <w:t>14</w:t>
+              <w:t>16</w:t>
             </w:r>
             <w:r>
               <w:rPr>
@@ -5340,7 +5274,7 @@
                 <w:sz w:val="28"/>
                 <w:szCs w:val="28"/>
               </w:rPr>
-              <w:t>14</w:t>
+              <w:t>16</w:t>
             </w:r>
             <w:r>
               <w:rPr>
@@ -5437,7 +5371,7 @@
                 <w:sz w:val="28"/>
                 <w:szCs w:val="28"/>
               </w:rPr>
-              <w:t>14</w:t>
+              <w:t>16</w:t>
             </w:r>
             <w:r>
               <w:rPr>
@@ -5534,7 +5468,7 @@
                 <w:sz w:val="28"/>
                 <w:szCs w:val="28"/>
               </w:rPr>
-              <w:t>15</w:t>
+              <w:t>17</w:t>
             </w:r>
             <w:r>
               <w:rPr>
@@ -5631,7 +5565,7 @@
                 <w:sz w:val="28"/>
                 <w:szCs w:val="28"/>
               </w:rPr>
-              <w:t>15</w:t>
+              <w:t>17</w:t>
             </w:r>
             <w:r>
               <w:rPr>
@@ -5728,7 +5662,7 @@
                 <w:sz w:val="28"/>
                 <w:szCs w:val="28"/>
               </w:rPr>
-              <w:t>15</w:t>
+              <w:t>17</w:t>
             </w:r>
             <w:r>
               <w:rPr>
@@ -5825,7 +5759,7 @@
                 <w:sz w:val="28"/>
                 <w:szCs w:val="28"/>
               </w:rPr>
-              <w:t>15</w:t>
+              <w:t>17</w:t>
             </w:r>
             <w:r>
               <w:rPr>
@@ -5922,7 +5856,7 @@
                 <w:sz w:val="28"/>
                 <w:szCs w:val="28"/>
               </w:rPr>
-              <w:t>15</w:t>
+              <w:t>17</w:t>
             </w:r>
             <w:r>
               <w:rPr>
@@ -6019,7 +5953,7 @@
                 <w:sz w:val="28"/>
                 <w:szCs w:val="28"/>
               </w:rPr>
-              <w:t>15</w:t>
+              <w:t>18</w:t>
             </w:r>
             <w:r>
               <w:rPr>
@@ -6116,7 +6050,7 @@
                 <w:sz w:val="28"/>
                 <w:szCs w:val="28"/>
               </w:rPr>
-              <w:t>16</w:t>
+              <w:t>18</w:t>
             </w:r>
             <w:r>
               <w:rPr>
@@ -6213,7 +6147,104 @@
                 <w:sz w:val="28"/>
                 <w:szCs w:val="28"/>
               </w:rPr>
-              <w:t>16</w:t>
+              <w:t>18</w:t>
+            </w:r>
+            <w:r>
+              <w:rPr>
+                <w:rFonts w:cs="Times New Roman"/>
+                <w:noProof/>
+                <w:webHidden/>
+                <w:sz w:val="28"/>
+                <w:szCs w:val="28"/>
+              </w:rPr>
+              <w:fldChar w:fldCharType="end"/>
+            </w:r>
+          </w:hyperlink>
+        </w:p>
+        <w:p>
+          <w:pPr>
+            <w:pStyle w:val="14"/>
+            <w:tabs>
+              <w:tab w:val="right" w:leader="dot" w:pos="9679"/>
+            </w:tabs>
+            <w:rPr>
+              <w:rFonts w:eastAsiaTheme="minorEastAsia" w:cs="Times New Roman"/>
+              <w:noProof/>
+              <w:sz w:val="28"/>
+              <w:szCs w:val="28"/>
+              <w:lang w:val="ru-RU" w:eastAsia="ru-RU"/>
+            </w:rPr>
+          </w:pPr>
+          <w:hyperlink w:anchor="_TocSchemaDatabase" w:history="1">
+            <w:r>
+              <w:rPr>
+                <w:rStyle w:val="aff8"/>
+                <w:rFonts w:cs="Times New Roman"/>
+                <w:noProof/>
+                <w:sz w:val="28"/>
+                <w:szCs w:val="28"/>
+                <w:lang w:val="ru-RU"/>
+              </w:rPr>
+              <w:t>ПРИЛОЖЕНИЕ 2</w:t>
+            </w:r>
+            <w:r>
+              <w:rPr>
+                <w:rFonts w:cs="Times New Roman"/>
+                <w:noProof/>
+                <w:webHidden/>
+                <w:sz w:val="28"/>
+                <w:szCs w:val="28"/>
+              </w:rPr>
+              <w:tab/>
+            </w:r>
+            <w:r>
+              <w:rPr>
+                <w:rFonts w:cs="Times New Roman"/>
+                <w:noProof/>
+                <w:webHidden/>
+                <w:sz w:val="28"/>
+                <w:szCs w:val="28"/>
+              </w:rPr>
+              <w:fldChar w:fldCharType="begin"/>
+            </w:r>
+            <w:r>
+              <w:rPr>
+                <w:rFonts w:cs="Times New Roman"/>
+                <w:noProof/>
+                <w:webHidden/>
+                <w:sz w:val="28"/>
+                <w:szCs w:val="28"/>
+              </w:rPr>
+              <w:instrText xml:space="preserve"> PAGEREF _TocSchemaDatabase \h </w:instrText>
+            </w:r>
+            <w:r>
+              <w:rPr>
+                <w:rFonts w:cs="Times New Roman"/>
+                <w:noProof/>
+                <w:webHidden/>
+                <w:sz w:val="28"/>
+                <w:szCs w:val="28"/>
+              </w:rPr>
+            </w:r>
+            <w:r>
+              <w:rPr>
+                <w:rFonts w:cs="Times New Roman"/>
+                <w:noProof/>
+                <w:webHidden/>
+                <w:sz w:val="28"/>
+                <w:szCs w:val="28"/>
+              </w:rPr>
+              <w:fldChar w:fldCharType="separate"/>
+            </w:r>
+            <w:r>
+              <w:rPr>
+                <w:rFonts w:cs="Times New Roman"/>
+                <w:noProof/>
+                <w:webHidden/>
+                <w:sz w:val="28"/>
+                <w:szCs w:val="28"/>
+              </w:rPr>
+              <w:t>20</w:t>
             </w:r>
             <w:r>
               <w:rPr>
@@ -6323,47 +6354,7 @@
         </w:rPr>
       </w:pPr>
       <w:r>
-        <w:rPr>
-          <w:rFonts w:cs="Times New Roman"/>
-          <w:sz w:val="28"/>
-          <w:szCs w:val="28"/>
-          <w:lang w:val="ru-RU"/>
-        </w:rPr>
-        <w:t xml:space="preserve">Полное наименование системы: </w:t>
-      </w:r>
-      <w:r>
-        <w:rPr>
-          <w:rFonts w:cs="Times New Roman"/>
-          <w:sz w:val="28"/>
-          <w:szCs w:val="28"/>
-        </w:rPr>
-        <w:t>HTTP</w:t>
-      </w:r>
-      <w:r>
-        <w:rPr>
-          <w:rFonts w:cs="Times New Roman"/>
-          <w:sz w:val="28"/>
-          <w:szCs w:val="28"/>
-          <w:lang w:val="ru-RU"/>
-        </w:rPr>
-        <w:t xml:space="preserve"> </w:t>
-      </w:r>
-      <w:r>
-        <w:rPr>
-          <w:rFonts w:cs="Times New Roman"/>
-          <w:sz w:val="28"/>
-          <w:szCs w:val="28"/>
-        </w:rPr>
-        <w:t>API</w:t>
-      </w:r>
-      <w:r>
-        <w:rPr>
-          <w:rFonts w:cs="Times New Roman"/>
-          <w:sz w:val="28"/>
-          <w:szCs w:val="28"/>
-          <w:lang w:val="ru-RU"/>
-        </w:rPr>
-        <w:t xml:space="preserve"> «Аукционы».</w:t>
+        <w:t>Полное наименование системы: Система «Аукционы» с веб-интерфейсом и HTTP API.</w:t>
       </w:r>
     </w:p>
     <w:p>
@@ -6376,30 +6367,7 @@
         </w:rPr>
       </w:pPr>
       <w:r>
-        <w:rPr>
-          <w:rFonts w:cs="Times New Roman"/>
-          <w:sz w:val="28"/>
-          <w:szCs w:val="28"/>
-          <w:lang w:val="ru-RU"/>
-        </w:rPr>
-        <w:t xml:space="preserve">Условное обозначение: Система, </w:t>
-      </w:r>
-      <w:r>
-        <w:rPr>
-          <w:rFonts w:cs="Times New Roman"/>
-          <w:sz w:val="28"/>
-          <w:szCs w:val="28"/>
-        </w:rPr>
-        <w:t>API</w:t>
-      </w:r>
-      <w:r>
-        <w:rPr>
-          <w:rFonts w:cs="Times New Roman"/>
-          <w:sz w:val="28"/>
-          <w:szCs w:val="28"/>
-          <w:lang w:val="ru-RU"/>
-        </w:rPr>
-        <w:t xml:space="preserve"> «Аукционы».</w:t>
+        <w:t>Условное обозначение: Система «Аукционы».</w:t>
       </w:r>
     </w:p>
     <w:p>
@@ -7113,13 +7081,7 @@
         </w:rPr>
       </w:pPr>
       <w:r>
-        <w:rPr>
-          <w:rFonts w:cs="Times New Roman"/>
-          <w:sz w:val="28"/>
-          <w:szCs w:val="28"/>
-          <w:lang w:val="ru-RU"/>
-        </w:rPr>
-        <w:t>Система предназначена для хранения информации об аукционах и регистрации результатов продажи лотов.</w:t>
+        <w:t>Система предназначена для учёта аукционов, участников, лотов, заявок на покупку, продаж и доходов организатора.</w:t>
       </w:r>
     </w:p>
     <w:p>
@@ -7132,47 +7094,7 @@
         </w:rPr>
       </w:pPr>
       <w:r>
-        <w:rPr>
-          <w:rFonts w:cs="Times New Roman"/>
-          <w:sz w:val="28"/>
-          <w:szCs w:val="28"/>
-          <w:lang w:val="ru-RU"/>
-        </w:rPr>
-        <w:t xml:space="preserve">Система представляет собой </w:t>
-      </w:r>
-      <w:r>
-        <w:rPr>
-          <w:rFonts w:cs="Times New Roman"/>
-          <w:sz w:val="28"/>
-          <w:szCs w:val="28"/>
-        </w:rPr>
-        <w:t>HTTP</w:t>
-      </w:r>
-      <w:r>
-        <w:rPr>
-          <w:rFonts w:cs="Times New Roman"/>
-          <w:sz w:val="28"/>
-          <w:szCs w:val="28"/>
-          <w:lang w:val="ru-RU"/>
-        </w:rPr>
-        <w:t xml:space="preserve"> </w:t>
-      </w:r>
-      <w:r>
-        <w:rPr>
-          <w:rFonts w:cs="Times New Roman"/>
-          <w:sz w:val="28"/>
-          <w:szCs w:val="28"/>
-        </w:rPr>
-        <w:t>API</w:t>
-      </w:r>
-      <w:r>
-        <w:rPr>
-          <w:rFonts w:cs="Times New Roman"/>
-          <w:sz w:val="28"/>
-          <w:szCs w:val="28"/>
-          <w:lang w:val="ru-RU"/>
-        </w:rPr>
-        <w:t xml:space="preserve"> для учета аукционов, выставленных лотов, продавцов, покупателей, продаж и доходов организатора.</w:t>
+        <w:t>Система включает веб-интерфейс с авторизацией и ролями, а также HTTP API для обмена данными.</w:t>
       </w:r>
     </w:p>
     <w:p>
@@ -7228,59 +7150,8 @@
           <w:szCs w:val="28"/>
         </w:rPr>
       </w:pPr>
-      <w:proofErr w:type="spellStart"/>
-      <w:r>
-        <w:rPr>
-          <w:rFonts w:cs="Times New Roman"/>
-          <w:sz w:val="28"/>
-          <w:szCs w:val="28"/>
-        </w:rPr>
-        <w:t>создание</w:t>
-      </w:r>
-      <w:proofErr w:type="spellEnd"/>
-      <w:r>
-        <w:rPr>
-          <w:rFonts w:cs="Times New Roman"/>
-          <w:sz w:val="28"/>
-          <w:szCs w:val="28"/>
-        </w:rPr>
-        <w:t xml:space="preserve"> </w:t>
-      </w:r>
-      <w:proofErr w:type="spellStart"/>
-      <w:r>
-        <w:rPr>
-          <w:rFonts w:cs="Times New Roman"/>
-          <w:sz w:val="28"/>
-          <w:szCs w:val="28"/>
-        </w:rPr>
-        <w:t>продавцов</w:t>
-      </w:r>
-      <w:proofErr w:type="spellEnd"/>
-      <w:r>
-        <w:rPr>
-          <w:rFonts w:cs="Times New Roman"/>
-          <w:sz w:val="28"/>
-          <w:szCs w:val="28"/>
-        </w:rPr>
-        <w:t xml:space="preserve"> и </w:t>
-      </w:r>
-      <w:proofErr w:type="spellStart"/>
-      <w:r>
-        <w:rPr>
-          <w:rFonts w:cs="Times New Roman"/>
-          <w:sz w:val="28"/>
-          <w:szCs w:val="28"/>
-        </w:rPr>
-        <w:t>покупателей</w:t>
-      </w:r>
-      <w:proofErr w:type="spellEnd"/>
-      <w:r>
-        <w:rPr>
-          <w:rFonts w:cs="Times New Roman"/>
-          <w:sz w:val="28"/>
-          <w:szCs w:val="28"/>
-        </w:rPr>
-        <w:t>;</w:t>
+      <w:r>
+        <w:t>создание учётных записей и профилей продавцов и покупателей;</w:t>
       </w:r>
     </w:p>
     <w:p>
@@ -7340,77 +7211,8 @@
           <w:szCs w:val="28"/>
         </w:rPr>
       </w:pPr>
-      <w:proofErr w:type="spellStart"/>
-      <w:r>
-        <w:rPr>
-          <w:rFonts w:cs="Times New Roman"/>
-          <w:sz w:val="28"/>
-          <w:szCs w:val="28"/>
-        </w:rPr>
-        <w:t>добавление</w:t>
-      </w:r>
-      <w:proofErr w:type="spellEnd"/>
-      <w:r>
-        <w:rPr>
-          <w:rFonts w:cs="Times New Roman"/>
-          <w:sz w:val="28"/>
-          <w:szCs w:val="28"/>
-        </w:rPr>
-        <w:t xml:space="preserve"> </w:t>
-      </w:r>
-      <w:proofErr w:type="spellStart"/>
-      <w:r>
-        <w:rPr>
-          <w:rFonts w:cs="Times New Roman"/>
-          <w:sz w:val="28"/>
-          <w:szCs w:val="28"/>
-        </w:rPr>
-        <w:t>лотов</w:t>
-      </w:r>
-      <w:proofErr w:type="spellEnd"/>
-      <w:r>
-        <w:rPr>
-          <w:rFonts w:cs="Times New Roman"/>
-          <w:sz w:val="28"/>
-          <w:szCs w:val="28"/>
-        </w:rPr>
-        <w:t xml:space="preserve"> </w:t>
-      </w:r>
-      <w:proofErr w:type="spellStart"/>
-      <w:r>
-        <w:rPr>
-          <w:rFonts w:cs="Times New Roman"/>
-          <w:sz w:val="28"/>
-          <w:szCs w:val="28"/>
-        </w:rPr>
-        <w:t>на</w:t>
-      </w:r>
-      <w:proofErr w:type="spellEnd"/>
-      <w:r>
-        <w:rPr>
-          <w:rFonts w:cs="Times New Roman"/>
-          <w:sz w:val="28"/>
-          <w:szCs w:val="28"/>
-        </w:rPr>
-        <w:t xml:space="preserve"> </w:t>
-      </w:r>
-      <w:proofErr w:type="spellStart"/>
-      <w:r>
-        <w:rPr>
-          <w:rFonts w:cs="Times New Roman"/>
-          <w:sz w:val="28"/>
-          <w:szCs w:val="28"/>
-        </w:rPr>
-        <w:t>аукционы</w:t>
-      </w:r>
-      <w:proofErr w:type="spellEnd"/>
-      <w:r>
-        <w:rPr>
-          <w:rFonts w:cs="Times New Roman"/>
-          <w:sz w:val="28"/>
-          <w:szCs w:val="28"/>
-        </w:rPr>
-        <w:t>;</w:t>
+      <w:r>
+        <w:t>добавление продавцами лотов на аукционы;</w:t>
       </w:r>
     </w:p>
     <w:p>
@@ -7423,77 +7225,8 @@
           <w:szCs w:val="28"/>
         </w:rPr>
       </w:pPr>
-      <w:proofErr w:type="spellStart"/>
-      <w:r>
-        <w:rPr>
-          <w:rFonts w:cs="Times New Roman"/>
-          <w:sz w:val="28"/>
-          <w:szCs w:val="28"/>
-        </w:rPr>
-        <w:t>регистрация</w:t>
-      </w:r>
-      <w:proofErr w:type="spellEnd"/>
-      <w:r>
-        <w:rPr>
-          <w:rFonts w:cs="Times New Roman"/>
-          <w:sz w:val="28"/>
-          <w:szCs w:val="28"/>
-        </w:rPr>
-        <w:t xml:space="preserve"> </w:t>
-      </w:r>
-      <w:proofErr w:type="spellStart"/>
-      <w:r>
-        <w:rPr>
-          <w:rFonts w:cs="Times New Roman"/>
-          <w:sz w:val="28"/>
-          <w:szCs w:val="28"/>
-        </w:rPr>
-        <w:t>продажи</w:t>
-      </w:r>
-      <w:proofErr w:type="spellEnd"/>
-      <w:r>
-        <w:rPr>
-          <w:rFonts w:cs="Times New Roman"/>
-          <w:sz w:val="28"/>
-          <w:szCs w:val="28"/>
-        </w:rPr>
-        <w:t xml:space="preserve"> </w:t>
-      </w:r>
-      <w:proofErr w:type="spellStart"/>
-      <w:r>
-        <w:rPr>
-          <w:rFonts w:cs="Times New Roman"/>
-          <w:sz w:val="28"/>
-          <w:szCs w:val="28"/>
-        </w:rPr>
-        <w:t>лота</w:t>
-      </w:r>
-      <w:proofErr w:type="spellEnd"/>
-      <w:r>
-        <w:rPr>
-          <w:rFonts w:cs="Times New Roman"/>
-          <w:sz w:val="28"/>
-          <w:szCs w:val="28"/>
-        </w:rPr>
-        <w:t xml:space="preserve"> </w:t>
-      </w:r>
-      <w:proofErr w:type="spellStart"/>
-      <w:r>
-        <w:rPr>
-          <w:rFonts w:cs="Times New Roman"/>
-          <w:sz w:val="28"/>
-          <w:szCs w:val="28"/>
-        </w:rPr>
-        <w:t>покупателю</w:t>
-      </w:r>
-      <w:proofErr w:type="spellEnd"/>
-      <w:r>
-        <w:rPr>
-          <w:rFonts w:cs="Times New Roman"/>
-          <w:sz w:val="28"/>
-          <w:szCs w:val="28"/>
-        </w:rPr>
-        <w:t>;</w:t>
+      <w:r>
+        <w:t>подача покупателями заявок на покупку и их рассмотрение администратором;</w:t>
       </w:r>
     </w:p>
     <w:p>
@@ -7508,13 +7241,7 @@
         </w:rPr>
       </w:pPr>
       <w:r>
-        <w:rPr>
-          <w:rFonts w:cs="Times New Roman"/>
-          <w:sz w:val="28"/>
-          <w:szCs w:val="28"/>
-          <w:lang w:val="ru-RU"/>
-        </w:rPr>
-        <w:t>расчет дохода организатора от продажи;</w:t>
+        <w:t>регистрация продажи и расчёт дохода после подтверждения заявки;</w:t>
       </w:r>
     </w:p>
     <w:p>
@@ -7529,13 +7256,7 @@
         </w:rPr>
       </w:pPr>
       <w:r>
-        <w:rPr>
-          <w:rFonts w:cs="Times New Roman"/>
-          <w:sz w:val="28"/>
-          <w:szCs w:val="28"/>
-          <w:lang w:val="ru-RU"/>
-        </w:rPr>
-        <w:t>получение информации об аукционах, лотах и продажах.</w:t>
+        <w:t>получение информации об аукционах, лотах, заявках, продажах и доходах;</w:t>
       </w:r>
     </w:p>
     <w:p>
@@ -7593,47 +7314,7 @@
         </w:rPr>
       </w:pPr>
       <w:r>
-        <w:rPr>
-          <w:rFonts w:cs="Times New Roman"/>
-          <w:sz w:val="28"/>
-          <w:szCs w:val="28"/>
-          <w:lang w:val="ru-RU"/>
-        </w:rPr>
-        <w:t xml:space="preserve">Объектом автоматизации являются процессы учета аукционов, лотов, продавцов, покупателей, продаж и доходов организатора, а также предоставления соответствующей информации через </w:t>
-      </w:r>
-      <w:r>
-        <w:rPr>
-          <w:rFonts w:cs="Times New Roman"/>
-          <w:sz w:val="28"/>
-          <w:szCs w:val="28"/>
-        </w:rPr>
-        <w:t>HTTP</w:t>
-      </w:r>
-      <w:r>
-        <w:rPr>
-          <w:rFonts w:cs="Times New Roman"/>
-          <w:sz w:val="28"/>
-          <w:szCs w:val="28"/>
-          <w:lang w:val="ru-RU"/>
-        </w:rPr>
-        <w:t xml:space="preserve"> </w:t>
-      </w:r>
-      <w:r>
-        <w:rPr>
-          <w:rFonts w:cs="Times New Roman"/>
-          <w:sz w:val="28"/>
-          <w:szCs w:val="28"/>
-        </w:rPr>
-        <w:t>API</w:t>
-      </w:r>
-      <w:r>
-        <w:rPr>
-          <w:rFonts w:cs="Times New Roman"/>
-          <w:sz w:val="28"/>
-          <w:szCs w:val="28"/>
-          <w:lang w:val="ru-RU"/>
-        </w:rPr>
-        <w:t>.</w:t>
+        <w:t>Объектом автоматизации являются процессы учёта аукционов, лотов, участников, заявок, продаж и доходов, а также работа пользователей через веб-интерфейс и HTTP API.</w:t>
       </w:r>
     </w:p>
     <w:p>
@@ -7719,13 +7400,7 @@
         </w:rPr>
       </w:pPr>
       <w:r>
-        <w:rPr>
-          <w:rFonts w:cs="Times New Roman"/>
-          <w:sz w:val="28"/>
-          <w:szCs w:val="28"/>
-          <w:lang w:val="ru-RU"/>
-        </w:rPr>
-        <w:t>создание и получение данных о продавцах;</w:t>
+        <w:t>создание учётных записей и получение данных о продавцах;</w:t>
       </w:r>
     </w:p>
     <w:p>
@@ -7740,12 +7415,6 @@
         </w:rPr>
       </w:pPr>
       <w:r>
-        <w:rPr>
-          <w:rFonts w:cs="Times New Roman"/>
-          <w:sz w:val="28"/>
-          <w:szCs w:val="28"/>
-          <w:lang w:val="ru-RU"/>
-        </w:rPr>
         <w:t>создание и получение данных о покупателях;</w:t>
       </w:r>
     </w:p>
@@ -7803,13 +7472,7 @@
         </w:rPr>
       </w:pPr>
       <w:r>
-        <w:rPr>
-          <w:rFonts w:cs="Times New Roman"/>
-          <w:sz w:val="28"/>
-          <w:szCs w:val="28"/>
-          <w:lang w:val="ru-RU"/>
-        </w:rPr>
-        <w:t>регистрация и получение данных о продажах;</w:t>
+        <w:t>подача и рассмотрение заявок на покупку, учёт продаж;</w:t>
       </w:r>
     </w:p>
     <w:p>
@@ -7982,13 +7645,7 @@
         </w:rPr>
       </w:pPr>
       <w:r>
-        <w:rPr>
-          <w:rFonts w:cs="Times New Roman"/>
-          <w:sz w:val="28"/>
-          <w:szCs w:val="28"/>
-          <w:lang w:val="ru-RU"/>
-        </w:rPr>
-        <w:t>Администратор — создает аукционы, добавляет сведения о лотах и регистрирует результаты продаж.</w:t>
+        <w:t>Администратор — создаёт учётные записи, назначает профили продавца и покупателя, создаёт аукционы, рассматривает заявки и просматривает доходы.</w:t>
       </w:r>
     </w:p>
     <w:p>
@@ -8003,13 +7660,7 @@
         </w:rPr>
       </w:pPr>
       <w:r>
-        <w:rPr>
-          <w:rFonts w:cs="Times New Roman"/>
-          <w:sz w:val="28"/>
-          <w:szCs w:val="28"/>
-          <w:lang w:val="ru-RU"/>
-        </w:rPr>
-        <w:t>Продавец — передает лоты для участия в аукционе и может просматривать информацию о своих лотах.</w:t>
+        <w:t>Продавец — выставляет лоты, видит свои лоты, заявки и продажи по ним.</w:t>
       </w:r>
     </w:p>
     <w:p>
@@ -8024,13 +7675,13 @@
         </w:rPr>
       </w:pPr>
       <w:r>
-        <w:rPr>
-          <w:rFonts w:cs="Times New Roman"/>
-          <w:sz w:val="28"/>
-          <w:szCs w:val="28"/>
-          <w:lang w:val="ru-RU"/>
-        </w:rPr>
-        <w:t>Покупатель — приобретает лоты и может просматривать информацию о совершенных покупках.</w:t>
+        <w:t>Покупатель — видит доступные лоты, отправляет заявки и просматривает свои покупки.</w:t>
+      </w:r>
+    </w:p>
+    <w:p>
+      <w:pPr/>
+      <w:r>
+        <w:t>Пользователь без назначенного профиля видит список аукционов; операции продавца и покупателя ему недоступны.</w:t>
       </w:r>
     </w:p>
     <w:p>
@@ -8112,47 +7763,7 @@
         </w:rPr>
       </w:pPr>
       <w:r>
-        <w:rPr>
-          <w:rFonts w:cs="Times New Roman"/>
-          <w:sz w:val="28"/>
-          <w:szCs w:val="28"/>
-          <w:lang w:val="ru-RU"/>
-        </w:rPr>
-        <w:t xml:space="preserve">Система должна быть реализована как </w:t>
-      </w:r>
-      <w:r>
-        <w:rPr>
-          <w:rFonts w:cs="Times New Roman"/>
-          <w:sz w:val="28"/>
-          <w:szCs w:val="28"/>
-        </w:rPr>
-        <w:t>HTTP</w:t>
-      </w:r>
-      <w:r>
-        <w:rPr>
-          <w:rFonts w:cs="Times New Roman"/>
-          <w:sz w:val="28"/>
-          <w:szCs w:val="28"/>
-          <w:lang w:val="ru-RU"/>
-        </w:rPr>
-        <w:t xml:space="preserve"> </w:t>
-      </w:r>
-      <w:r>
-        <w:rPr>
-          <w:rFonts w:cs="Times New Roman"/>
-          <w:sz w:val="28"/>
-          <w:szCs w:val="28"/>
-        </w:rPr>
-        <w:t>API</w:t>
-      </w:r>
-      <w:r>
-        <w:rPr>
-          <w:rFonts w:cs="Times New Roman"/>
-          <w:sz w:val="28"/>
-          <w:szCs w:val="28"/>
-          <w:lang w:val="ru-RU"/>
-        </w:rPr>
-        <w:t xml:space="preserve"> на базе следующих технологий:</w:t>
+        <w:t>Система реализована на Python и FastAPI, содержит HTTP API и собственный веб-интерфейс. Минимальные версии компонентов:</w:t>
       </w:r>
     </w:p>
     <w:p>
@@ -8166,12 +7777,7 @@
         </w:rPr>
       </w:pPr>
       <w:r>
-        <w:rPr>
-          <w:rFonts w:cs="Times New Roman"/>
-          <w:sz w:val="28"/>
-          <w:szCs w:val="28"/>
-        </w:rPr>
-        <w:t>Python 3.12;</w:t>
+        <w:t>Python от 3.12 (поддерживаются 3.12 и 3.13);</w:t>
       </w:r>
     </w:p>
     <w:p>
@@ -8184,23 +7790,8 @@
           <w:szCs w:val="28"/>
         </w:rPr>
       </w:pPr>
-      <w:proofErr w:type="spellStart"/>
-      <w:r>
-        <w:rPr>
-          <w:rFonts w:cs="Times New Roman"/>
-          <w:sz w:val="28"/>
-          <w:szCs w:val="28"/>
-        </w:rPr>
-        <w:t>FastAPI</w:t>
-      </w:r>
-      <w:proofErr w:type="spellEnd"/>
-      <w:r>
-        <w:rPr>
-          <w:rFonts w:cs="Times New Roman"/>
-          <w:sz w:val="28"/>
-          <w:szCs w:val="28"/>
-        </w:rPr>
-        <w:t>;</w:t>
+      <w:r>
+        <w:t>FastAPI от 0.115 и Uvicorn от 0.34;</w:t>
       </w:r>
     </w:p>
     <w:p>
@@ -8214,12 +7805,7 @@
         </w:rPr>
       </w:pPr>
       <w:r>
-        <w:rPr>
-          <w:rFonts w:cs="Times New Roman"/>
-          <w:sz w:val="28"/>
-          <w:szCs w:val="28"/>
-        </w:rPr>
-        <w:t>PostgreSQL;</w:t>
+        <w:t>PostgreSQL от 14;</w:t>
       </w:r>
     </w:p>
     <w:p>
@@ -8232,23 +7818,8 @@
           <w:szCs w:val="28"/>
         </w:rPr>
       </w:pPr>
-      <w:proofErr w:type="spellStart"/>
-      <w:r>
-        <w:rPr>
-          <w:rFonts w:cs="Times New Roman"/>
-          <w:sz w:val="28"/>
-          <w:szCs w:val="28"/>
-        </w:rPr>
-        <w:t>SQLAlchemy</w:t>
-      </w:r>
-      <w:proofErr w:type="spellEnd"/>
-      <w:r>
-        <w:rPr>
-          <w:rFonts w:cs="Times New Roman"/>
-          <w:sz w:val="28"/>
-          <w:szCs w:val="28"/>
-        </w:rPr>
-        <w:t>;</w:t>
+      <w:r>
+        <w:t>SQLAlchemy от 2.0 и psycopg от 3.2;</w:t>
       </w:r>
     </w:p>
     <w:p>
@@ -8262,12 +7833,7 @@
         </w:rPr>
       </w:pPr>
       <w:r>
-        <w:rPr>
-          <w:rFonts w:cs="Times New Roman"/>
-          <w:sz w:val="28"/>
-          <w:szCs w:val="28"/>
-        </w:rPr>
-        <w:t>Alembic;</w:t>
+        <w:t>Alembic от 1.14 и Pydantic Settings от 2.7;</w:t>
       </w:r>
     </w:p>
     <w:p>
@@ -8280,23 +7846,8 @@
           <w:szCs w:val="28"/>
         </w:rPr>
       </w:pPr>
-      <w:proofErr w:type="spellStart"/>
-      <w:r>
-        <w:rPr>
-          <w:rFonts w:cs="Times New Roman"/>
-          <w:sz w:val="28"/>
-          <w:szCs w:val="28"/>
-        </w:rPr>
-        <w:t>pytest</w:t>
-      </w:r>
-      <w:proofErr w:type="spellEnd"/>
-      <w:r>
-        <w:rPr>
-          <w:rFonts w:cs="Times New Roman"/>
-          <w:sz w:val="28"/>
-          <w:szCs w:val="28"/>
-        </w:rPr>
-        <w:t>;</w:t>
+      <w:r>
+        <w:t>itsdangerous от 2.2; для разработки — httpx от 0.28, pytest от 8.3 и pytest-cov от 6;</w:t>
       </w:r>
     </w:p>
     <w:p>
@@ -8310,12 +7861,7 @@
         </w:rPr>
       </w:pPr>
       <w:r>
-        <w:rPr>
-          <w:rFonts w:cs="Times New Roman"/>
-          <w:sz w:val="28"/>
-          <w:szCs w:val="28"/>
-        </w:rPr>
-        <w:t>Ruff;</w:t>
+        <w:t>Ruff от 0.9;</w:t>
       </w:r>
     </w:p>
     <w:p>
@@ -8328,23 +7874,8 @@
           <w:szCs w:val="28"/>
         </w:rPr>
       </w:pPr>
-      <w:proofErr w:type="spellStart"/>
-      <w:r>
-        <w:rPr>
-          <w:rFonts w:cs="Times New Roman"/>
-          <w:sz w:val="28"/>
-          <w:szCs w:val="28"/>
-        </w:rPr>
-        <w:t>uv</w:t>
-      </w:r>
-      <w:proofErr w:type="spellEnd"/>
-      <w:r>
-        <w:rPr>
-          <w:rFonts w:cs="Times New Roman"/>
-          <w:sz w:val="28"/>
-          <w:szCs w:val="28"/>
-        </w:rPr>
-        <w:t>.</w:t>
+      <w:r>
+        <w:t>uv от 0.10.7 и GNU Make. Ограничения версий Python и библиотек приведены в pyproject.toml; версии PostgreSQL и uv там не закреплены.</w:t>
       </w:r>
     </w:p>
     <w:p>
@@ -8357,47 +7888,7 @@
         </w:rPr>
       </w:pPr>
       <w:r>
-        <w:rPr>
-          <w:rFonts w:cs="Times New Roman"/>
-          <w:sz w:val="28"/>
-          <w:szCs w:val="28"/>
-          <w:lang w:val="ru-RU"/>
-        </w:rPr>
-        <w:t xml:space="preserve">Система должна предоставлять </w:t>
-      </w:r>
-      <w:r>
-        <w:rPr>
-          <w:rFonts w:cs="Times New Roman"/>
-          <w:sz w:val="28"/>
-          <w:szCs w:val="28"/>
-        </w:rPr>
-        <w:t>HTTP</w:t>
-      </w:r>
-      <w:r>
-        <w:rPr>
-          <w:rFonts w:cs="Times New Roman"/>
-          <w:sz w:val="28"/>
-          <w:szCs w:val="28"/>
-          <w:lang w:val="ru-RU"/>
-        </w:rPr>
-        <w:t xml:space="preserve"> </w:t>
-      </w:r>
-      <w:r>
-        <w:rPr>
-          <w:rFonts w:cs="Times New Roman"/>
-          <w:sz w:val="28"/>
-          <w:szCs w:val="28"/>
-        </w:rPr>
-        <w:t>API</w:t>
-      </w:r>
-      <w:r>
-        <w:rPr>
-          <w:rFonts w:cs="Times New Roman"/>
-          <w:sz w:val="28"/>
-          <w:szCs w:val="28"/>
-          <w:lang w:val="ru-RU"/>
-        </w:rPr>
-        <w:t xml:space="preserve"> для операций с продавцами, покупателями, аукционами, лотами, продажами и доходами.</w:t>
+        <w:t>Система предоставляет маршруты для учёта данных, входа и выхода, кабинета пользователей, заявок и их рассмотрения.</w:t>
       </w:r>
     </w:p>
     <w:p>
@@ -8410,47 +7901,7 @@
         </w:rPr>
       </w:pPr>
       <w:r>
-        <w:rPr>
-          <w:rFonts w:cs="Times New Roman"/>
-          <w:sz w:val="28"/>
-          <w:szCs w:val="28"/>
-          <w:lang w:val="ru-RU"/>
-        </w:rPr>
-        <w:t xml:space="preserve">Система должна предоставлять служебный адрес </w:t>
-      </w:r>
-      <w:r>
-        <w:rPr>
-          <w:rFonts w:cs="Times New Roman"/>
-          <w:sz w:val="28"/>
-          <w:szCs w:val="28"/>
-        </w:rPr>
-        <w:t>GET</w:t>
-      </w:r>
-      <w:r>
-        <w:rPr>
-          <w:rFonts w:cs="Times New Roman"/>
-          <w:sz w:val="28"/>
-          <w:szCs w:val="28"/>
-          <w:lang w:val="ru-RU"/>
-        </w:rPr>
-        <w:t xml:space="preserve"> /</w:t>
-      </w:r>
-      <w:r>
-        <w:rPr>
-          <w:rFonts w:cs="Times New Roman"/>
-          <w:sz w:val="28"/>
-          <w:szCs w:val="28"/>
-        </w:rPr>
-        <w:t>health</w:t>
-      </w:r>
-      <w:r>
-        <w:rPr>
-          <w:rFonts w:cs="Times New Roman"/>
-          <w:sz w:val="28"/>
-          <w:szCs w:val="28"/>
-          <w:lang w:val="ru-RU"/>
-        </w:rPr>
-        <w:t>. Успешный ответ означает, что приложение запущено и готово принимать запросы.</w:t>
+        <w:t>GET /health возвращает ответ приложения {"status":"ok"}; соединение с базой данных этим маршрутом не проверяется.</w:t>
       </w:r>
     </w:p>
     <w:p>
@@ -8506,13 +7957,7 @@
         </w:rPr>
       </w:pPr>
       <w:r>
-        <w:rPr>
-          <w:rFonts w:cs="Times New Roman"/>
-          <w:sz w:val="28"/>
-          <w:szCs w:val="28"/>
-          <w:lang w:val="ru-RU"/>
-        </w:rPr>
-        <w:t>Функциональные категории пользователей определены в п. 3.2 настоящего ТЗ: Администратор, Продавец, Покупатель.</w:t>
+        <w:t>Функциональные категории: администратор и пользователь с профилем продавца или покупателя. Пользователь без профиля может видеть аукционы.</w:t>
       </w:r>
     </w:p>
     <w:p>
@@ -8549,64 +7994,7 @@
         </w:rPr>
       </w:pPr>
       <w:r>
-        <w:rPr>
-          <w:rFonts w:cs="Times New Roman"/>
-          <w:sz w:val="28"/>
-          <w:szCs w:val="28"/>
-          <w:lang w:val="ru-RU"/>
-        </w:rPr>
-        <w:t xml:space="preserve">Система должна предоставлять служебный </w:t>
-      </w:r>
-      <w:r>
-        <w:rPr>
-          <w:rFonts w:cs="Times New Roman"/>
-          <w:sz w:val="28"/>
-          <w:szCs w:val="28"/>
-        </w:rPr>
-        <w:t>endpoint</w:t>
-      </w:r>
-      <w:r>
-        <w:rPr>
-          <w:rFonts w:cs="Times New Roman"/>
-          <w:sz w:val="28"/>
-          <w:szCs w:val="28"/>
-          <w:lang w:val="ru-RU"/>
-        </w:rPr>
-        <w:t xml:space="preserve"> </w:t>
-      </w:r>
-      <w:r>
-        <w:rPr>
-          <w:rFonts w:cs="Times New Roman"/>
-          <w:sz w:val="28"/>
-          <w:szCs w:val="28"/>
-        </w:rPr>
-        <w:t>GET</w:t>
-      </w:r>
-      <w:r>
-        <w:rPr>
-          <w:rFonts w:cs="Times New Roman"/>
-          <w:sz w:val="28"/>
-          <w:szCs w:val="28"/>
-          <w:lang w:val="ru-RU"/>
-        </w:rPr>
-        <w:t xml:space="preserve"> /</w:t>
-      </w:r>
-      <w:r>
-        <w:rPr>
-          <w:rFonts w:cs="Times New Roman"/>
-          <w:sz w:val="28"/>
-          <w:szCs w:val="28"/>
-        </w:rPr>
-        <w:t>health</w:t>
-      </w:r>
-      <w:r>
-        <w:rPr>
-          <w:rFonts w:cs="Times New Roman"/>
-          <w:sz w:val="28"/>
-          <w:szCs w:val="28"/>
-          <w:lang w:val="ru-RU"/>
-        </w:rPr>
-        <w:t xml:space="preserve"> для проверки работоспособности приложения.</w:t>
+        <w:t>GET /health проверяет ответ приложения. Изменения продажи, дохода, статуса лота и заявки при подтверждении выполняются в одной транзакции.</w:t>
       </w:r>
     </w:p>
     <w:p>
@@ -8733,30 +8121,7 @@
         </w:rPr>
       </w:pPr>
       <w:r>
-        <w:rPr>
-          <w:rFonts w:cs="Times New Roman"/>
-          <w:sz w:val="28"/>
-          <w:szCs w:val="28"/>
-          <w:lang w:val="ru-RU"/>
-        </w:rPr>
-        <w:t xml:space="preserve">Ответы </w:t>
-      </w:r>
-      <w:r>
-        <w:rPr>
-          <w:rFonts w:cs="Times New Roman"/>
-          <w:sz w:val="28"/>
-          <w:szCs w:val="28"/>
-        </w:rPr>
-        <w:t>API</w:t>
-      </w:r>
-      <w:r>
-        <w:rPr>
-          <w:rFonts w:cs="Times New Roman"/>
-          <w:sz w:val="28"/>
-          <w:szCs w:val="28"/>
-          <w:lang w:val="ru-RU"/>
-        </w:rPr>
-        <w:t xml:space="preserve"> об ошибках не должны раскрывать пароли, строки подключения, трассировки и другие внутренние данные приложения.</w:t>
+        <w:t>Вход выполняется по логину и паролю; пароль хранится как хеш PBKDF2-SHA256. Маршруты веб-кабинета проверяют сессию и роль.</w:t>
       </w:r>
     </w:p>
     <w:p>
@@ -8769,62 +8134,7 @@
         </w:rPr>
       </w:pPr>
       <w:r>
-        <w:rPr>
-          <w:rFonts w:cs="Times New Roman"/>
-          <w:sz w:val="28"/>
-          <w:szCs w:val="28"/>
-          <w:lang w:val="ru-RU"/>
-        </w:rPr>
-        <w:t xml:space="preserve">Секреты и локальный </w:t>
-      </w:r>
-      <w:proofErr w:type="gramStart"/>
-      <w:r>
-        <w:rPr>
-          <w:rFonts w:cs="Times New Roman"/>
-          <w:sz w:val="28"/>
-          <w:szCs w:val="28"/>
-          <w:lang w:val="ru-RU"/>
-        </w:rPr>
-        <w:t>файл .</w:t>
-      </w:r>
-      <w:proofErr w:type="spellStart"/>
-      <w:r>
-        <w:rPr>
-          <w:rFonts w:cs="Times New Roman"/>
-          <w:sz w:val="28"/>
-          <w:szCs w:val="28"/>
-        </w:rPr>
-        <w:t>env</w:t>
-      </w:r>
-      <w:proofErr w:type="spellEnd"/>
-      <w:proofErr w:type="gramEnd"/>
-      <w:r>
-        <w:rPr>
-          <w:rFonts w:cs="Times New Roman"/>
-          <w:sz w:val="28"/>
-          <w:szCs w:val="28"/>
-          <w:lang w:val="ru-RU"/>
-        </w:rPr>
-        <w:t xml:space="preserve"> не должны сохраняться в </w:t>
-      </w:r>
-      <w:proofErr w:type="spellStart"/>
-      <w:r>
-        <w:rPr>
-          <w:rFonts w:cs="Times New Roman"/>
-          <w:sz w:val="28"/>
-          <w:szCs w:val="28"/>
-        </w:rPr>
-        <w:t>Git</w:t>
-      </w:r>
-      <w:proofErr w:type="spellEnd"/>
-      <w:r>
-        <w:rPr>
-          <w:rFonts w:cs="Times New Roman"/>
-          <w:sz w:val="28"/>
-          <w:szCs w:val="28"/>
-          <w:lang w:val="ru-RU"/>
-        </w:rPr>
-        <w:t>.</w:t>
+        <w:t>Рабочие секреты и локальный файл .env не должны сохраняться в Git. Перед развёртыванием необходимо заменить демонстрационные ADMIN_PASSWORD и SESSION_SECRET.</w:t>
       </w:r>
     </w:p>
     <w:p>
@@ -8836,52 +8146,8 @@
           <w:lang w:val="ru-RU"/>
         </w:rPr>
       </w:pPr>
-      <w:proofErr w:type="gramStart"/>
-      <w:r>
-        <w:rPr>
-          <w:rFonts w:cs="Times New Roman"/>
-          <w:sz w:val="28"/>
-          <w:szCs w:val="28"/>
-          <w:lang w:val="ru-RU"/>
-        </w:rPr>
-        <w:t>Файл .</w:t>
-      </w:r>
-      <w:proofErr w:type="spellStart"/>
-      <w:r>
-        <w:rPr>
-          <w:rFonts w:cs="Times New Roman"/>
-          <w:sz w:val="28"/>
-          <w:szCs w:val="28"/>
-        </w:rPr>
-        <w:t>env</w:t>
-      </w:r>
-      <w:proofErr w:type="spellEnd"/>
-      <w:proofErr w:type="gramEnd"/>
-      <w:r>
-        <w:rPr>
-          <w:rFonts w:cs="Times New Roman"/>
-          <w:sz w:val="28"/>
-          <w:szCs w:val="28"/>
-          <w:lang w:val="ru-RU"/>
-        </w:rPr>
-        <w:t>.</w:t>
-      </w:r>
-      <w:r>
-        <w:rPr>
-          <w:rFonts w:cs="Times New Roman"/>
-          <w:sz w:val="28"/>
-          <w:szCs w:val="28"/>
-        </w:rPr>
-        <w:t>example</w:t>
-      </w:r>
-      <w:r>
-        <w:rPr>
-          <w:rFonts w:cs="Times New Roman"/>
-          <w:sz w:val="28"/>
-          <w:szCs w:val="28"/>
-          <w:lang w:val="ru-RU"/>
-        </w:rPr>
-        <w:t xml:space="preserve"> должен содержать только примеры безопасных значений.</w:t>
+      <w:r>
+        <w:t>Файл .env.example содержит пример конфигурации; его значения нельзя использовать как рабочие секреты.</w:t>
       </w:r>
     </w:p>
     <w:p>
@@ -8918,64 +8184,13 @@
         </w:rPr>
       </w:pPr>
       <w:r>
-        <w:rPr>
-          <w:rFonts w:cs="Times New Roman"/>
-          <w:sz w:val="28"/>
-          <w:szCs w:val="28"/>
-          <w:lang w:val="ru-RU"/>
-        </w:rPr>
-        <w:t xml:space="preserve">Форматы запросов и ответов должны быть доступны для проверки через </w:t>
-      </w:r>
-      <w:r>
-        <w:rPr>
-          <w:rFonts w:cs="Times New Roman"/>
-          <w:sz w:val="28"/>
-          <w:szCs w:val="28"/>
-        </w:rPr>
-        <w:t>Swagger</w:t>
-      </w:r>
-      <w:r>
-        <w:rPr>
-          <w:rFonts w:cs="Times New Roman"/>
-          <w:sz w:val="28"/>
-          <w:szCs w:val="28"/>
-          <w:lang w:val="ru-RU"/>
-        </w:rPr>
-        <w:t xml:space="preserve"> </w:t>
-      </w:r>
-      <w:r>
-        <w:rPr>
-          <w:rFonts w:cs="Times New Roman"/>
-          <w:sz w:val="28"/>
-          <w:szCs w:val="28"/>
-        </w:rPr>
-        <w:t>UI</w:t>
-      </w:r>
-      <w:r>
-        <w:rPr>
-          <w:rFonts w:cs="Times New Roman"/>
-          <w:sz w:val="28"/>
-          <w:szCs w:val="28"/>
-          <w:lang w:val="ru-RU"/>
-        </w:rPr>
-        <w:t>, предоставляемый приложением по адресу /</w:t>
-      </w:r>
-      <w:r>
-        <w:rPr>
-          <w:rFonts w:cs="Times New Roman"/>
-          <w:sz w:val="28"/>
-          <w:szCs w:val="28"/>
-        </w:rPr>
-        <w:t>docs</w:t>
-      </w:r>
-      <w:r>
-        <w:rPr>
-          <w:rFonts w:cs="Times New Roman"/>
-          <w:sz w:val="28"/>
-          <w:szCs w:val="28"/>
-          <w:lang w:val="ru-RU"/>
-        </w:rPr>
-        <w:t>.</w:t>
+        <w:t>Веб-интерфейс доступен по /login и /app. Swagger UI по /docs предназначен для просмотра и проверки форматов HTTP API.</w:t>
+      </w:r>
+    </w:p>
+    <w:p>
+      <w:pPr/>
+      <w:r>
+        <w:t>Страница входа отправляет POST /auth/login. После успешного входа /app показывает разделы по роли; POST /auth/logout завершает сессию. Первый администратор создаётся при попытке входа, если администраторов ещё нет, из переменных ADMIN_*.</w:t>
       </w:r>
     </w:p>
     <w:p>
@@ -9012,30 +8227,7 @@
         </w:rPr>
       </w:pPr>
       <w:r>
-        <w:rPr>
-          <w:rFonts w:cs="Times New Roman"/>
-          <w:sz w:val="28"/>
-          <w:szCs w:val="28"/>
-          <w:lang w:val="ru-RU"/>
-        </w:rPr>
-        <w:t xml:space="preserve">При обработке ошибок </w:t>
-      </w:r>
-      <w:r>
-        <w:rPr>
-          <w:rFonts w:cs="Times New Roman"/>
-          <w:sz w:val="28"/>
-          <w:szCs w:val="28"/>
-        </w:rPr>
-        <w:t>API</w:t>
-      </w:r>
-      <w:r>
-        <w:rPr>
-          <w:rFonts w:cs="Times New Roman"/>
-          <w:sz w:val="28"/>
-          <w:szCs w:val="28"/>
-          <w:lang w:val="ru-RU"/>
-        </w:rPr>
-        <w:t xml:space="preserve"> запрещается раскрывать внутренние данные приложения, указанные в п. 4.1.4.</w:t>
+        <w:t>Доступ к маршрутам /web/* проверяется по сессии и роли. Исходные маршруты создания и чтения продавцов, покупателей, аукционов и лотов, а также чтения продаж и доходов сейчас доступны без входа; POST /sales требует роли администратора.</w:t>
       </w:r>
     </w:p>
     <w:p>
@@ -9144,13 +8336,7 @@
         </w:rPr>
       </w:pPr>
       <w:r>
-        <w:rPr>
-          <w:rFonts w:cs="Times New Roman"/>
-          <w:sz w:val="28"/>
-          <w:szCs w:val="28"/>
-          <w:lang w:val="ru-RU"/>
-        </w:rPr>
-        <w:t>Операции создания продажи и соответствующего дохода должны выполняться атомарно в одной транзакции.</w:t>
+        <w:t>Создание продажи, дохода и изменение статусов лота и заявки при подтверждении выполняются атомарно.</w:t>
       </w:r>
     </w:p>
     <w:p>
@@ -9359,23 +8545,8 @@
           <w:szCs w:val="28"/>
         </w:rPr>
       </w:pPr>
-      <w:proofErr w:type="spellStart"/>
-      <w:r>
-        <w:rPr>
-          <w:rFonts w:cs="Times New Roman"/>
-          <w:sz w:val="28"/>
-          <w:szCs w:val="28"/>
-        </w:rPr>
-        <w:t>продавцы</w:t>
-      </w:r>
-      <w:proofErr w:type="spellEnd"/>
-      <w:r>
-        <w:rPr>
-          <w:rFonts w:cs="Times New Roman"/>
-          <w:sz w:val="28"/>
-          <w:szCs w:val="28"/>
-        </w:rPr>
-        <w:t>;</w:t>
+      <w:r>
+        <w:t>учётные записи;</w:t>
       </w:r>
     </w:p>
     <w:p>
@@ -9388,23 +8559,8 @@
           <w:szCs w:val="28"/>
         </w:rPr>
       </w:pPr>
-      <w:proofErr w:type="spellStart"/>
-      <w:r>
-        <w:rPr>
-          <w:rFonts w:cs="Times New Roman"/>
-          <w:sz w:val="28"/>
-          <w:szCs w:val="28"/>
-        </w:rPr>
-        <w:t>покупатели</w:t>
-      </w:r>
-      <w:proofErr w:type="spellEnd"/>
-      <w:r>
-        <w:rPr>
-          <w:rFonts w:cs="Times New Roman"/>
-          <w:sz w:val="28"/>
-          <w:szCs w:val="28"/>
-        </w:rPr>
-        <w:t>;</w:t>
+      <w:r>
+        <w:t>продавцы и покупатели;</w:t>
       </w:r>
     </w:p>
     <w:p>
@@ -9417,23 +8573,8 @@
           <w:szCs w:val="28"/>
         </w:rPr>
       </w:pPr>
-      <w:proofErr w:type="spellStart"/>
-      <w:r>
-        <w:rPr>
-          <w:rFonts w:cs="Times New Roman"/>
-          <w:sz w:val="28"/>
-          <w:szCs w:val="28"/>
-        </w:rPr>
-        <w:t>аукционы</w:t>
-      </w:r>
-      <w:proofErr w:type="spellEnd"/>
-      <w:r>
-        <w:rPr>
-          <w:rFonts w:cs="Times New Roman"/>
-          <w:sz w:val="28"/>
-          <w:szCs w:val="28"/>
-        </w:rPr>
-        <w:t>;</w:t>
+      <w:r>
+        <w:t>аукционы;</w:t>
       </w:r>
     </w:p>
     <w:p>
@@ -9446,23 +8587,8 @@
           <w:szCs w:val="28"/>
         </w:rPr>
       </w:pPr>
-      <w:proofErr w:type="spellStart"/>
-      <w:r>
-        <w:rPr>
-          <w:rFonts w:cs="Times New Roman"/>
-          <w:sz w:val="28"/>
-          <w:szCs w:val="28"/>
-        </w:rPr>
-        <w:t>лоты</w:t>
-      </w:r>
-      <w:proofErr w:type="spellEnd"/>
-      <w:r>
-        <w:rPr>
-          <w:rFonts w:cs="Times New Roman"/>
-          <w:sz w:val="28"/>
-          <w:szCs w:val="28"/>
-        </w:rPr>
-        <w:t>;</w:t>
+      <w:r>
+        <w:t>лоты;</w:t>
       </w:r>
     </w:p>
     <w:p>
@@ -9475,23 +8601,8 @@
           <w:szCs w:val="28"/>
         </w:rPr>
       </w:pPr>
-      <w:proofErr w:type="spellStart"/>
-      <w:r>
-        <w:rPr>
-          <w:rFonts w:cs="Times New Roman"/>
-          <w:sz w:val="28"/>
-          <w:szCs w:val="28"/>
-        </w:rPr>
-        <w:t>продажи</w:t>
-      </w:r>
-      <w:proofErr w:type="spellEnd"/>
-      <w:r>
-        <w:rPr>
-          <w:rFonts w:cs="Times New Roman"/>
-          <w:sz w:val="28"/>
-          <w:szCs w:val="28"/>
-        </w:rPr>
-        <w:t>;</w:t>
+      <w:r>
+        <w:t>заявки на покупку и продажи;</w:t>
       </w:r>
     </w:p>
     <w:p>
@@ -9504,41 +8615,8 @@
           <w:szCs w:val="28"/>
         </w:rPr>
       </w:pPr>
-      <w:proofErr w:type="spellStart"/>
-      <w:r>
-        <w:rPr>
-          <w:rFonts w:cs="Times New Roman"/>
-          <w:sz w:val="28"/>
-          <w:szCs w:val="28"/>
-        </w:rPr>
-        <w:t>доходы</w:t>
-      </w:r>
-      <w:proofErr w:type="spellEnd"/>
-      <w:r>
-        <w:rPr>
-          <w:rFonts w:cs="Times New Roman"/>
-          <w:sz w:val="28"/>
-          <w:szCs w:val="28"/>
-        </w:rPr>
-        <w:t xml:space="preserve"> </w:t>
-      </w:r>
-      <w:proofErr w:type="spellStart"/>
-      <w:r>
-        <w:rPr>
-          <w:rFonts w:cs="Times New Roman"/>
-          <w:sz w:val="28"/>
-          <w:szCs w:val="28"/>
-        </w:rPr>
-        <w:t>организатора</w:t>
-      </w:r>
-      <w:proofErr w:type="spellEnd"/>
-      <w:r>
-        <w:rPr>
-          <w:rFonts w:cs="Times New Roman"/>
-          <w:sz w:val="28"/>
-          <w:szCs w:val="28"/>
-        </w:rPr>
-        <w:t>.</w:t>
+      <w:r>
+        <w:t>доходы организатора.</w:t>
       </w:r>
     </w:p>
     <w:p>
@@ -9551,13 +8629,7 @@
         </w:rPr>
       </w:pPr>
       <w:r>
-        <w:rPr>
-          <w:rFonts w:cs="Times New Roman"/>
-          <w:sz w:val="28"/>
-          <w:szCs w:val="28"/>
-          <w:lang w:val="ru-RU"/>
-        </w:rPr>
-        <w:t>Связи между сущностями должны обеспечиваться внешними ключами.</w:t>
+        <w:t>Связи между восемью таблицами обеспечиваются внешними ключами с запретом удаления связанных записей (ON DELETE RESTRICT).</w:t>
       </w:r>
     </w:p>
     <w:p>
@@ -9570,13 +8642,7 @@
         </w:rPr>
       </w:pPr>
       <w:r>
-        <w:rPr>
-          <w:rFonts w:cs="Times New Roman"/>
-          <w:sz w:val="28"/>
-          <w:szCs w:val="28"/>
-          <w:lang w:val="ru-RU"/>
-        </w:rPr>
-        <w:t>Уникальность продажи лота должна обеспечиваться ограничением базы данных.</w:t>
+        <w:t>Уникальны логин учётной записи, привязки профилей продавца и покупателя, продажа одного лота и доход одной продажи.</w:t>
       </w:r>
     </w:p>
     <w:p>
@@ -9608,30 +8674,7 @@
         </w:rPr>
       </w:pPr>
       <w:r>
-        <w:rPr>
-          <w:rFonts w:cs="Times New Roman"/>
-          <w:sz w:val="28"/>
-          <w:szCs w:val="28"/>
-          <w:lang w:val="ru-RU"/>
-        </w:rPr>
-        <w:t xml:space="preserve">Даты и время должны храниться в часовом поясе </w:t>
-      </w:r>
-      <w:r>
-        <w:rPr>
-          <w:rFonts w:cs="Times New Roman"/>
-          <w:sz w:val="28"/>
-          <w:szCs w:val="28"/>
-        </w:rPr>
-        <w:t>UTC</w:t>
-      </w:r>
-      <w:r>
-        <w:rPr>
-          <w:rFonts w:cs="Times New Roman"/>
-          <w:sz w:val="28"/>
-          <w:szCs w:val="28"/>
-          <w:lang w:val="ru-RU"/>
-        </w:rPr>
-        <w:t>.</w:t>
+        <w:t>Временные отметки сохраняются с часовым поясом; даты аукционов приводятся к UTC.</w:t>
       </w:r>
     </w:p>
     <w:p>
@@ -9745,49 +8788,7 @@
         </w:rPr>
       </w:pPr>
       <w:r>
-        <w:rPr>
-          <w:rFonts w:cs="Times New Roman"/>
-          <w:sz w:val="28"/>
-          <w:szCs w:val="28"/>
-          <w:lang w:val="ru-RU"/>
-        </w:rPr>
-        <w:t xml:space="preserve">Программное обеспечение должно быть реализовано на </w:t>
-      </w:r>
-      <w:r>
-        <w:rPr>
-          <w:rFonts w:cs="Times New Roman"/>
-          <w:sz w:val="28"/>
-          <w:szCs w:val="28"/>
-        </w:rPr>
-        <w:t>Python</w:t>
-      </w:r>
-      <w:r>
-        <w:rPr>
-          <w:rFonts w:cs="Times New Roman"/>
-          <w:sz w:val="28"/>
-          <w:szCs w:val="28"/>
-          <w:lang w:val="ru-RU"/>
-        </w:rPr>
-        <w:t xml:space="preserve"> 3.12 с использованием </w:t>
-      </w:r>
-      <w:proofErr w:type="spellStart"/>
-      <w:r>
-        <w:rPr>
-          <w:rFonts w:cs="Times New Roman"/>
-          <w:sz w:val="28"/>
-          <w:szCs w:val="28"/>
-        </w:rPr>
-        <w:t>FastAPI</w:t>
-      </w:r>
-      <w:proofErr w:type="spellEnd"/>
-      <w:r>
-        <w:rPr>
-          <w:rFonts w:cs="Times New Roman"/>
-          <w:sz w:val="28"/>
-          <w:szCs w:val="28"/>
-          <w:lang w:val="ru-RU"/>
-        </w:rPr>
-        <w:t>.</w:t>
+        <w:t>Программное обеспечение реализовано на Python 3.12 или 3.13 с использованием FastAPI и Uvicorn.</w:t>
       </w:r>
     </w:p>
     <w:p>
@@ -9800,66 +8801,7 @@
         </w:rPr>
       </w:pPr>
       <w:r>
-        <w:rPr>
-          <w:rFonts w:cs="Times New Roman"/>
-          <w:sz w:val="28"/>
-          <w:szCs w:val="28"/>
-          <w:lang w:val="ru-RU"/>
-        </w:rPr>
-        <w:t xml:space="preserve">Для работы с базой данных должны использоваться </w:t>
-      </w:r>
-      <w:r>
-        <w:rPr>
-          <w:rFonts w:cs="Times New Roman"/>
-          <w:sz w:val="28"/>
-          <w:szCs w:val="28"/>
-        </w:rPr>
-        <w:t>PostgreSQL</w:t>
-      </w:r>
-      <w:r>
-        <w:rPr>
-          <w:rFonts w:cs="Times New Roman"/>
-          <w:sz w:val="28"/>
-          <w:szCs w:val="28"/>
-          <w:lang w:val="ru-RU"/>
-        </w:rPr>
-        <w:t xml:space="preserve"> и </w:t>
-      </w:r>
-      <w:proofErr w:type="spellStart"/>
-      <w:r>
-        <w:rPr>
-          <w:rFonts w:cs="Times New Roman"/>
-          <w:sz w:val="28"/>
-          <w:szCs w:val="28"/>
-        </w:rPr>
-        <w:t>SQLAlchemy</w:t>
-      </w:r>
-      <w:proofErr w:type="spellEnd"/>
-      <w:r>
-        <w:rPr>
-          <w:rFonts w:cs="Times New Roman"/>
-          <w:sz w:val="28"/>
-          <w:szCs w:val="28"/>
-          <w:lang w:val="ru-RU"/>
-        </w:rPr>
-        <w:t xml:space="preserve">. Изменения структуры базы данных должны выполняться через </w:t>
-      </w:r>
-      <w:r>
-        <w:rPr>
-          <w:rFonts w:cs="Times New Roman"/>
-          <w:sz w:val="28"/>
-          <w:szCs w:val="28"/>
-        </w:rPr>
-        <w:t>Alembic</w:t>
-      </w:r>
-      <w:r>
-        <w:rPr>
-          <w:rFonts w:cs="Times New Roman"/>
-          <w:sz w:val="28"/>
-          <w:szCs w:val="28"/>
-          <w:lang w:val="ru-RU"/>
-        </w:rPr>
-        <w:t>.</w:t>
+        <w:t>Постоянное хранение выполняется в PostgreSQL через SQLAlchemy и psycopg; миграции — Alembic.</w:t>
       </w:r>
     </w:p>
     <w:p>
@@ -9872,69 +8814,7 @@
         </w:rPr>
       </w:pPr>
       <w:r>
-        <w:rPr>
-          <w:rFonts w:cs="Times New Roman"/>
-          <w:sz w:val="28"/>
-          <w:szCs w:val="28"/>
-          <w:lang w:val="ru-RU"/>
-        </w:rPr>
-        <w:lastRenderedPageBreak/>
-        <w:t xml:space="preserve">Для автоматизированного тестирования используется </w:t>
-      </w:r>
-      <w:proofErr w:type="spellStart"/>
-      <w:r>
-        <w:rPr>
-          <w:rFonts w:cs="Times New Roman"/>
-          <w:sz w:val="28"/>
-          <w:szCs w:val="28"/>
-        </w:rPr>
-        <w:t>pytest</w:t>
-      </w:r>
-      <w:proofErr w:type="spellEnd"/>
-      <w:r>
-        <w:rPr>
-          <w:rFonts w:cs="Times New Roman"/>
-          <w:sz w:val="28"/>
-          <w:szCs w:val="28"/>
-          <w:lang w:val="ru-RU"/>
-        </w:rPr>
-        <w:t xml:space="preserve">. Для статического анализа и форматирования используется </w:t>
-      </w:r>
-      <w:r>
-        <w:rPr>
-          <w:rFonts w:cs="Times New Roman"/>
-          <w:sz w:val="28"/>
-          <w:szCs w:val="28"/>
-        </w:rPr>
-        <w:t>Ruff</w:t>
-      </w:r>
-      <w:r>
-        <w:rPr>
-          <w:rFonts w:cs="Times New Roman"/>
-          <w:sz w:val="28"/>
-          <w:szCs w:val="28"/>
-          <w:lang w:val="ru-RU"/>
-        </w:rPr>
-        <w:t xml:space="preserve">. Управление окружением и зависимостями выполняется с помощью </w:t>
-      </w:r>
-      <w:proofErr w:type="spellStart"/>
-      <w:r>
-        <w:rPr>
-          <w:rFonts w:cs="Times New Roman"/>
-          <w:sz w:val="28"/>
-          <w:szCs w:val="28"/>
-        </w:rPr>
-        <w:t>uv</w:t>
-      </w:r>
-      <w:proofErr w:type="spellEnd"/>
-      <w:r>
-        <w:rPr>
-          <w:rFonts w:cs="Times New Roman"/>
-          <w:sz w:val="28"/>
-          <w:szCs w:val="28"/>
-          <w:lang w:val="ru-RU"/>
-        </w:rPr>
-        <w:t>.</w:t>
+        <w:t>Для тестирования используются pytest, pytest-cov и httpx; для анализа и форматирования — Ruff; зависимости управляются через uv.</w:t>
       </w:r>
     </w:p>
     <w:p>
@@ -10296,38 +9176,7 @@
         </w:rPr>
       </w:pPr>
       <w:r>
-        <w:rPr>
-          <w:rFonts w:cs="Times New Roman"/>
-          <w:sz w:val="28"/>
-          <w:szCs w:val="28"/>
-        </w:rPr>
-        <w:t>HTTP</w:t>
-      </w:r>
-      <w:r>
-        <w:rPr>
-          <w:rFonts w:cs="Times New Roman"/>
-          <w:sz w:val="28"/>
-          <w:szCs w:val="28"/>
-          <w:lang w:val="ru-RU"/>
-        </w:rPr>
-        <w:t xml:space="preserve"> </w:t>
-      </w:r>
-      <w:r>
-        <w:rPr>
-          <w:rFonts w:cs="Times New Roman"/>
-          <w:sz w:val="28"/>
-          <w:szCs w:val="28"/>
-        </w:rPr>
-        <w:t>API</w:t>
-      </w:r>
-      <w:r>
-        <w:rPr>
-          <w:rFonts w:cs="Times New Roman"/>
-          <w:sz w:val="28"/>
-          <w:szCs w:val="28"/>
-          <w:lang w:val="ru-RU"/>
-        </w:rPr>
-        <w:t xml:space="preserve"> должно предоставлять следующие интерфейсы:</w:t>
+        <w:t>Основные маршруты HTTP API и веб-интерфейса:</w:t>
       </w:r>
     </w:p>
     <w:tbl>
@@ -12483,69 +11332,87 @@
       </w:tr>
     </w:tbl>
     <w:p>
-      <w:pPr>
-        <w:rPr>
-          <w:rFonts w:cs="Times New Roman"/>
-          <w:sz w:val="28"/>
-          <w:szCs w:val="28"/>
-        </w:rPr>
-      </w:pPr>
-      <w:proofErr w:type="spellStart"/>
-      <w:r>
-        <w:rPr>
-          <w:rFonts w:cs="Times New Roman"/>
-          <w:sz w:val="28"/>
-          <w:szCs w:val="28"/>
-        </w:rPr>
-        <w:t>Основные</w:t>
-      </w:r>
-      <w:proofErr w:type="spellEnd"/>
-      <w:r>
-        <w:rPr>
-          <w:rFonts w:cs="Times New Roman"/>
-          <w:sz w:val="28"/>
-          <w:szCs w:val="28"/>
-        </w:rPr>
-        <w:t xml:space="preserve"> </w:t>
-      </w:r>
-      <w:proofErr w:type="spellStart"/>
-      <w:r>
-        <w:rPr>
-          <w:rFonts w:cs="Times New Roman"/>
-          <w:sz w:val="28"/>
-          <w:szCs w:val="28"/>
-        </w:rPr>
-        <w:t>коды</w:t>
-      </w:r>
-      <w:proofErr w:type="spellEnd"/>
-      <w:r>
-        <w:rPr>
-          <w:rFonts w:cs="Times New Roman"/>
-          <w:sz w:val="28"/>
-          <w:szCs w:val="28"/>
-        </w:rPr>
-        <w:t xml:space="preserve"> </w:t>
-      </w:r>
-      <w:proofErr w:type="spellStart"/>
-      <w:r>
-        <w:rPr>
-          <w:rFonts w:cs="Times New Roman"/>
-          <w:sz w:val="28"/>
-          <w:szCs w:val="28"/>
-        </w:rPr>
-        <w:t>ответа</w:t>
-      </w:r>
-      <w:proofErr w:type="spellEnd"/>
-      <w:r>
-        <w:rPr>
-          <w:rFonts w:cs="Times New Roman"/>
-          <w:sz w:val="28"/>
-          <w:szCs w:val="28"/>
-        </w:rPr>
-        <w:t xml:space="preserve"> API:</w:t>
+      <w:pPr/>
+      <w:r>
+        <w:t>Веб-страницы и вход: GET /, /login, /app, /auth/me; POST /auth/login и /auth/logout.</w:t>
       </w:r>
     </w:p>
     <w:p>
+      <w:pPr/>
+      <w:r>
+        <w:t>Списки кабинета: GET /web/auctions, /web/lots, /web/sales, /web/purchase-requests. Администратору также доступны GET /web/revenues, /web/admin/accounts, /web/admin/sellers, /web/admin/buyers.</w:t>
+      </w:r>
+    </w:p>
+    <w:p>
+      <w:pPr/>
+      <w:r>
+        <w:t>Изменения через кабинет: POST /web/admin/accounts, /web/admin/participants, /web/admin/auctions; POST /web/seller/lots; POST /web/buyer/purchase-requests; POST /web/admin/purchase-requests/{id}/approve и /web/admin/purchase-requests/{id}/reject.</w:t>
+      </w:r>
+    </w:p>
+    <w:p>
+      <w:pPr>
+        <w:rPr>
+          <w:rFonts w:cs="Times New Roman"/>
+          <w:sz w:val="28"/>
+          <w:szCs w:val="28"/>
+        </w:rPr>
+      </w:pPr>
+      <w:proofErr w:type="spellStart"/>
+      <w:r>
+        <w:rPr>
+          <w:rFonts w:cs="Times New Roman"/>
+          <w:sz w:val="28"/>
+          <w:szCs w:val="28"/>
+        </w:rPr>
+        <w:t>Основные</w:t>
+      </w:r>
+      <w:proofErr w:type="spellEnd"/>
+      <w:r>
+        <w:rPr>
+          <w:rFonts w:cs="Times New Roman"/>
+          <w:sz w:val="28"/>
+          <w:szCs w:val="28"/>
+        </w:rPr>
+        <w:t xml:space="preserve"> </w:t>
+      </w:r>
+      <w:proofErr w:type="spellStart"/>
+      <w:r>
+        <w:rPr>
+          <w:rFonts w:cs="Times New Roman"/>
+          <w:sz w:val="28"/>
+          <w:szCs w:val="28"/>
+        </w:rPr>
+        <w:t>коды</w:t>
+      </w:r>
+      <w:proofErr w:type="spellEnd"/>
+      <w:r>
+        <w:rPr>
+          <w:rFonts w:cs="Times New Roman"/>
+          <w:sz w:val="28"/>
+          <w:szCs w:val="28"/>
+        </w:rPr>
+        <w:t xml:space="preserve"> </w:t>
+      </w:r>
+      <w:proofErr w:type="spellStart"/>
+      <w:r>
+        <w:rPr>
+          <w:rFonts w:cs="Times New Roman"/>
+          <w:sz w:val="28"/>
+          <w:szCs w:val="28"/>
+        </w:rPr>
+        <w:t>ответа</w:t>
+      </w:r>
+      <w:proofErr w:type="spellEnd"/>
+      <w:r>
+        <w:rPr>
+          <w:rFonts w:cs="Times New Roman"/>
+          <w:sz w:val="28"/>
+          <w:szCs w:val="28"/>
+        </w:rPr>
+        <w:t xml:space="preserve"> API:</w:t>
+      </w:r>
+    </w:p>
+    <w:p>
       <w:pPr>
         <w:pStyle w:val="a0"/>
         <w:ind w:left="709" w:hanging="283"/>
@@ -12629,48 +11496,7 @@
         </w:rPr>
       </w:pPr>
       <w:r>
-        <w:rPr>
-          <w:rFonts w:cs="Times New Roman"/>
-          <w:sz w:val="28"/>
-          <w:szCs w:val="28"/>
-        </w:rPr>
-        <w:t xml:space="preserve">201 Created — </w:t>
-      </w:r>
-      <w:proofErr w:type="spellStart"/>
-      <w:r>
-        <w:rPr>
-          <w:rFonts w:cs="Times New Roman"/>
-          <w:sz w:val="28"/>
-          <w:szCs w:val="28"/>
-        </w:rPr>
-        <w:t>сущность</w:t>
-      </w:r>
-      <w:proofErr w:type="spellEnd"/>
-      <w:r>
-        <w:rPr>
-          <w:rFonts w:cs="Times New Roman"/>
-          <w:sz w:val="28"/>
-          <w:szCs w:val="28"/>
-        </w:rPr>
-        <w:t xml:space="preserve"> </w:t>
-      </w:r>
-      <w:proofErr w:type="spellStart"/>
-      <w:r>
-        <w:rPr>
-          <w:rFonts w:cs="Times New Roman"/>
-          <w:sz w:val="28"/>
-          <w:szCs w:val="28"/>
-        </w:rPr>
-        <w:t>создана</w:t>
-      </w:r>
-      <w:proofErr w:type="spellEnd"/>
-      <w:r>
-        <w:rPr>
-          <w:rFonts w:cs="Times New Roman"/>
-          <w:sz w:val="28"/>
-          <w:szCs w:val="28"/>
-        </w:rPr>
-        <w:t>;</w:t>
+        <w:t>201 Created — создана сущность;</w:t>
       </w:r>
     </w:p>
     <w:p>
@@ -12795,30 +11621,7 @@
         </w:rPr>
       </w:pPr>
       <w:r>
-        <w:rPr>
-          <w:rFonts w:cs="Times New Roman"/>
-          <w:sz w:val="28"/>
-          <w:szCs w:val="28"/>
-          <w:lang w:val="ru-RU"/>
-        </w:rPr>
-        <w:t xml:space="preserve">409 </w:t>
-      </w:r>
-      <w:r>
-        <w:rPr>
-          <w:rFonts w:cs="Times New Roman"/>
-          <w:sz w:val="28"/>
-          <w:szCs w:val="28"/>
-        </w:rPr>
-        <w:t>Conflict</w:t>
-      </w:r>
-      <w:r>
-        <w:rPr>
-          <w:rFonts w:cs="Times New Roman"/>
-          <w:sz w:val="28"/>
-          <w:szCs w:val="28"/>
-          <w:lang w:val="ru-RU"/>
-        </w:rPr>
-        <w:t xml:space="preserve"> — данные конфликтуют с существующей записью;</w:t>
+        <w:t>401 Unauthorized — требуется вход; 403 Forbidden — недостаточно прав;</w:t>
       </w:r>
     </w:p>
     <w:p>
@@ -13027,13 +11830,7 @@
         </w:rPr>
       </w:pPr>
       <w:r>
-        <w:rPr>
-          <w:rFonts w:cs="Times New Roman"/>
-          <w:sz w:val="28"/>
-          <w:szCs w:val="28"/>
-          <w:lang w:val="ru-RU"/>
-        </w:rPr>
-        <w:t>Администратор передает название, дату начала и дату окончания аукциона. Система проверяет даты и сохраняет новый аукцион.</w:t>
+        <w:t>Администратор создаёт аукцион в кабинете; даты должны содержать часовой пояс, окончание должно быть позже начала. Исходный POST /auctions также доступен через API.</w:t>
       </w:r>
     </w:p>
     <w:p>
@@ -13070,13 +11867,7 @@
         </w:rPr>
       </w:pPr>
       <w:r>
-        <w:rPr>
-          <w:rFonts w:cs="Times New Roman"/>
-          <w:sz w:val="28"/>
-          <w:szCs w:val="28"/>
-          <w:lang w:val="ru-RU"/>
-        </w:rPr>
-        <w:t>Администратор выбирает аукцион и продавца, затем указывает название, описание и начальную цену лота. Система проверяет существование аукциона и продавца и сохраняет лот.</w:t>
+        <w:t>Продавец создаёт лот в существующем аукционе через кабинет; идентификатор продавца определяется по его учётной записи. Исходный POST /lots также доступен через API.</w:t>
       </w:r>
     </w:p>
     <w:p>
@@ -13113,13 +11904,13 @@
         </w:rPr>
       </w:pPr>
       <w:r>
-        <w:rPr>
-          <w:rFonts w:cs="Times New Roman"/>
-          <w:sz w:val="28"/>
-          <w:szCs w:val="28"/>
-          <w:lang w:val="ru-RU"/>
-        </w:rPr>
-        <w:t>Администратор выбирает лот и покупателя и указывает итоговую цену. Система проверяет возможность продажи, сохраняет сведения о продаже и рассчитывает доход организатора.</w:t>
+        <w:t>Покупатель отправляет заявку на доступный лот. Администратор подтверждает её, после чего в одной транзакции создаются продажа и доход, лот становится проданным. Отклонение сохраняет заявку и оставляет лот доступным. POST /sales позволяет администратору зарегистрировать продажу напрямую.</w:t>
+      </w:r>
+    </w:p>
+    <w:p>
+      <w:pPr/>
+      <w:r>
+        <w:t>Заявка имеет статус pending до решения администратора; предложенная цена не ниже начальной. Подтверждение переводит её в approved, отклонение — в rejected. Время рассмотрения сохраняется.</w:t>
       </w:r>
     </w:p>
     <w:p>
@@ -13157,47 +11948,7 @@
         </w:rPr>
       </w:pPr>
       <w:r>
-        <w:rPr>
-          <w:rFonts w:cs="Times New Roman"/>
-          <w:sz w:val="28"/>
-          <w:szCs w:val="28"/>
-          <w:lang w:val="ru-RU"/>
-        </w:rPr>
-        <w:t xml:space="preserve">Пользователь запрашивает списки аукционов, лотов, продавцов, покупателей и продаж через </w:t>
-      </w:r>
-      <w:r>
-        <w:rPr>
-          <w:rFonts w:cs="Times New Roman"/>
-          <w:sz w:val="28"/>
-          <w:szCs w:val="28"/>
-        </w:rPr>
-        <w:t>HTTP</w:t>
-      </w:r>
-      <w:r>
-        <w:rPr>
-          <w:rFonts w:cs="Times New Roman"/>
-          <w:sz w:val="28"/>
-          <w:szCs w:val="28"/>
-          <w:lang w:val="ru-RU"/>
-        </w:rPr>
-        <w:t xml:space="preserve"> </w:t>
-      </w:r>
-      <w:r>
-        <w:rPr>
-          <w:rFonts w:cs="Times New Roman"/>
-          <w:sz w:val="28"/>
-          <w:szCs w:val="28"/>
-        </w:rPr>
-        <w:t>API</w:t>
-      </w:r>
-      <w:r>
-        <w:rPr>
-          <w:rFonts w:cs="Times New Roman"/>
-          <w:sz w:val="28"/>
-          <w:szCs w:val="28"/>
-          <w:lang w:val="ru-RU"/>
-        </w:rPr>
-        <w:t>.</w:t>
+        <w:t>Кабинет показывает аукционы, лоты, заявки и продажи с учётом роли. Администратор также видит учётные записи, участников и доходы. Исходный JSON API предоставляет отдельные списки и карточки.</w:t>
       </w:r>
     </w:p>
     <w:p>
@@ -13234,47 +11985,7 @@
         </w:rPr>
       </w:pPr>
       <w:r>
-        <w:rPr>
-          <w:rFonts w:cs="Times New Roman"/>
-          <w:sz w:val="28"/>
-          <w:szCs w:val="28"/>
-          <w:lang w:val="ru-RU"/>
-        </w:rPr>
-        <w:t xml:space="preserve">Система предоставляет служебный адрес </w:t>
-      </w:r>
-      <w:r>
-        <w:rPr>
-          <w:rFonts w:cs="Times New Roman"/>
-          <w:sz w:val="28"/>
-          <w:szCs w:val="28"/>
-        </w:rPr>
-        <w:t>GET</w:t>
-      </w:r>
-      <w:r>
-        <w:rPr>
-          <w:rFonts w:cs="Times New Roman"/>
-          <w:sz w:val="28"/>
-          <w:szCs w:val="28"/>
-          <w:lang w:val="ru-RU"/>
-        </w:rPr>
-        <w:t xml:space="preserve"> /</w:t>
-      </w:r>
-      <w:r>
-        <w:rPr>
-          <w:rFonts w:cs="Times New Roman"/>
-          <w:sz w:val="28"/>
-          <w:szCs w:val="28"/>
-        </w:rPr>
-        <w:t>health</w:t>
-      </w:r>
-      <w:r>
-        <w:rPr>
-          <w:rFonts w:cs="Times New Roman"/>
-          <w:sz w:val="28"/>
-          <w:szCs w:val="28"/>
-          <w:lang w:val="ru-RU"/>
-        </w:rPr>
-        <w:t>. Успешный ответ означает, что приложение запущено и готово принимать запросы.</w:t>
+        <w:t>GET /health возвращает {"status":"ok"} при ответе приложения и не проверяет подключение к PostgreSQL.</w:t>
       </w:r>
     </w:p>
     <w:p>
@@ -13311,13 +12022,7 @@
         </w:rPr>
       </w:pPr>
       <w:r>
-        <w:rPr>
-          <w:rFonts w:cs="Times New Roman"/>
-          <w:sz w:val="28"/>
-          <w:szCs w:val="28"/>
-          <w:lang w:val="ru-RU"/>
-        </w:rPr>
-        <w:t>Продавец должен содержать уникальный идентификатор, имя, уникальный адрес электронной почты и дату создания.</w:t>
+        <w:t>Учётная запись содержит id, ФИО, уникальный логин, хеш пароля, роль admin или user, необязательные уникальные связи с продавцом и покупателем и дату создания.</w:t>
       </w:r>
     </w:p>
     <w:p>
@@ -13330,32 +12035,13 @@
         </w:rPr>
       </w:pPr>
       <w:r>
-        <w:rPr>
-          <w:rFonts w:cs="Times New Roman"/>
-          <w:sz w:val="28"/>
-          <w:szCs w:val="28"/>
-          <w:lang w:val="ru-RU"/>
-        </w:rPr>
-        <w:t>Покупатель должен содержать уникальный идентификатор, имя, уникальный адрес электронной почты и дату создания.</w:t>
+        <w:t>Продавец и покупатель содержат id, имя и дату создания. Поле email в текущей модели отсутствует.</w:t>
       </w:r>
     </w:p>
     <w:p>
-      <w:pPr>
-        <w:rPr>
-          <w:rFonts w:cs="Times New Roman"/>
-          <w:sz w:val="28"/>
-          <w:szCs w:val="28"/>
-          <w:lang w:val="ru-RU"/>
-        </w:rPr>
-      </w:pPr>
-      <w:r>
-        <w:rPr>
-          <w:rFonts w:cs="Times New Roman"/>
-          <w:sz w:val="28"/>
-          <w:szCs w:val="28"/>
-          <w:lang w:val="ru-RU"/>
-        </w:rPr>
-        <w:t>Аукцион должен содержать уникальный идентификатор, название, дату и время начала, дату и время окончания, статус и дату создания.</w:t>
+      <w:pPr/>
+      <w:r>
+        <w:t>Восемь таблиц схемы: accounts, sellers, buyers, auctions, lots, purchase_requests, sales, revenues. Уникальные связи accounts.seller_id и accounts.buyer_id позволяют закрепить профиль за одной учётной записью.</w:t>
       </w:r>
     </w:p>
     <w:p>
@@ -13368,64 +12054,7 @@
         </w:rPr>
       </w:pPr>
       <w:r>
-        <w:rPr>
-          <w:rFonts w:cs="Times New Roman"/>
-          <w:sz w:val="28"/>
-          <w:szCs w:val="28"/>
-          <w:lang w:val="ru-RU"/>
-        </w:rPr>
-        <w:t xml:space="preserve">Допустимые статусы аукциона: </w:t>
-      </w:r>
-      <w:r>
-        <w:rPr>
-          <w:rFonts w:cs="Times New Roman"/>
-          <w:sz w:val="28"/>
-          <w:szCs w:val="28"/>
-        </w:rPr>
-        <w:t>planned</w:t>
-      </w:r>
-      <w:r>
-        <w:rPr>
-          <w:rFonts w:cs="Times New Roman"/>
-          <w:sz w:val="28"/>
-          <w:szCs w:val="28"/>
-          <w:lang w:val="ru-RU"/>
-        </w:rPr>
-        <w:t xml:space="preserve"> — запланирован; </w:t>
-      </w:r>
-      <w:r>
-        <w:rPr>
-          <w:rFonts w:cs="Times New Roman"/>
-          <w:sz w:val="28"/>
-          <w:szCs w:val="28"/>
-        </w:rPr>
-        <w:t>active</w:t>
-      </w:r>
-      <w:r>
-        <w:rPr>
-          <w:rFonts w:cs="Times New Roman"/>
-          <w:sz w:val="28"/>
-          <w:szCs w:val="28"/>
-          <w:lang w:val="ru-RU"/>
-        </w:rPr>
-        <w:t xml:space="preserve"> — проводится; </w:t>
-      </w:r>
-      <w:r>
-        <w:rPr>
-          <w:rFonts w:cs="Times New Roman"/>
-          <w:sz w:val="28"/>
-          <w:szCs w:val="28"/>
-        </w:rPr>
-        <w:t>completed</w:t>
-      </w:r>
-      <w:r>
-        <w:rPr>
-          <w:rFonts w:cs="Times New Roman"/>
-          <w:sz w:val="28"/>
-          <w:szCs w:val="28"/>
-          <w:lang w:val="ru-RU"/>
-        </w:rPr>
-        <w:t xml:space="preserve"> — завершен.</w:t>
+        <w:t>Аукцион содержит id, название, время начала и окончания, статус и дату создания.</w:t>
       </w:r>
     </w:p>
     <w:p>
@@ -13444,7 +12073,58 @@
           <w:szCs w:val="28"/>
           <w:lang w:val="ru-RU"/>
         </w:rPr>
-        <w:t>Лот должен содержать уникальный идентификатор, идентификатор аукциона, идентификатор продавца, название, описание, начальную цену, статус и дату создания.</w:t>
+        <w:t xml:space="preserve">Допустимые статусы аукциона: </w:t>
+      </w:r>
+      <w:r>
+        <w:rPr>
+          <w:rFonts w:cs="Times New Roman"/>
+          <w:sz w:val="28"/>
+          <w:szCs w:val="28"/>
+        </w:rPr>
+        <w:t>planned</w:t>
+      </w:r>
+      <w:r>
+        <w:rPr>
+          <w:rFonts w:cs="Times New Roman"/>
+          <w:sz w:val="28"/>
+          <w:szCs w:val="28"/>
+          <w:lang w:val="ru-RU"/>
+        </w:rPr>
+        <w:t xml:space="preserve"> — запланирован; </w:t>
+      </w:r>
+      <w:r>
+        <w:rPr>
+          <w:rFonts w:cs="Times New Roman"/>
+          <w:sz w:val="28"/>
+          <w:szCs w:val="28"/>
+        </w:rPr>
+        <w:t>active</w:t>
+      </w:r>
+      <w:r>
+        <w:rPr>
+          <w:rFonts w:cs="Times New Roman"/>
+          <w:sz w:val="28"/>
+          <w:szCs w:val="28"/>
+          <w:lang w:val="ru-RU"/>
+        </w:rPr>
+        <w:t xml:space="preserve"> — проводится; </w:t>
+      </w:r>
+      <w:r>
+        <w:rPr>
+          <w:rFonts w:cs="Times New Roman"/>
+          <w:sz w:val="28"/>
+          <w:szCs w:val="28"/>
+        </w:rPr>
+        <w:t>completed</w:t>
+      </w:r>
+      <w:r>
+        <w:rPr>
+          <w:rFonts w:cs="Times New Roman"/>
+          <w:sz w:val="28"/>
+          <w:szCs w:val="28"/>
+          <w:lang w:val="ru-RU"/>
+        </w:rPr>
+        <w:t xml:space="preserve"> — завершен.</w:t>
       </w:r>
     </w:p>
     <w:p>
@@ -13457,47 +12137,7 @@
         </w:rPr>
       </w:pPr>
       <w:r>
-        <w:rPr>
-          <w:rFonts w:cs="Times New Roman"/>
-          <w:sz w:val="28"/>
-          <w:szCs w:val="28"/>
-          <w:lang w:val="ru-RU"/>
-        </w:rPr>
-        <w:t xml:space="preserve">Допустимые статусы лота: </w:t>
-      </w:r>
-      <w:r>
-        <w:rPr>
-          <w:rFonts w:cs="Times New Roman"/>
-          <w:sz w:val="28"/>
-          <w:szCs w:val="28"/>
-        </w:rPr>
-        <w:t>available</w:t>
-      </w:r>
-      <w:r>
-        <w:rPr>
-          <w:rFonts w:cs="Times New Roman"/>
-          <w:sz w:val="28"/>
-          <w:szCs w:val="28"/>
-          <w:lang w:val="ru-RU"/>
-        </w:rPr>
-        <w:t xml:space="preserve"> — доступен для продажи; </w:t>
-      </w:r>
-      <w:r>
-        <w:rPr>
-          <w:rFonts w:cs="Times New Roman"/>
-          <w:sz w:val="28"/>
-          <w:szCs w:val="28"/>
-        </w:rPr>
-        <w:t>sold</w:t>
-      </w:r>
-      <w:r>
-        <w:rPr>
-          <w:rFonts w:cs="Times New Roman"/>
-          <w:sz w:val="28"/>
-          <w:szCs w:val="28"/>
-          <w:lang w:val="ru-RU"/>
-        </w:rPr>
-        <w:t xml:space="preserve"> — продан.</w:t>
+        <w:t>Лот содержит id, идентификаторы аукциона и продавца, название, описание, начальную цену, статус и дату создания.</w:t>
       </w:r>
     </w:p>
     <w:p>
@@ -13516,27 +12156,41 @@
           <w:szCs w:val="28"/>
           <w:lang w:val="ru-RU"/>
         </w:rPr>
-        <w:t xml:space="preserve">Продажа должна содержать уникальный идентификатор, идентификатор лота, идентификатор покупателя, итоговую цену и </w:t>
-      </w:r>
-      <w:proofErr w:type="gramStart"/>
-      <w:r>
-        <w:rPr>
-          <w:rFonts w:cs="Times New Roman"/>
-          <w:sz w:val="28"/>
-          <w:szCs w:val="28"/>
-          <w:lang w:val="ru-RU"/>
-        </w:rPr>
-        <w:t>дату</w:t>
-      </w:r>
-      <w:proofErr w:type="gramEnd"/>
-      <w:r>
-        <w:rPr>
-          <w:rFonts w:cs="Times New Roman"/>
-          <w:sz w:val="28"/>
-          <w:szCs w:val="28"/>
-          <w:lang w:val="ru-RU"/>
-        </w:rPr>
-        <w:t xml:space="preserve"> и время продажи.</w:t>
+        <w:t xml:space="preserve">Допустимые статусы лота: </w:t>
+      </w:r>
+      <w:r>
+        <w:rPr>
+          <w:rFonts w:cs="Times New Roman"/>
+          <w:sz w:val="28"/>
+          <w:szCs w:val="28"/>
+        </w:rPr>
+        <w:t>available</w:t>
+      </w:r>
+      <w:r>
+        <w:rPr>
+          <w:rFonts w:cs="Times New Roman"/>
+          <w:sz w:val="28"/>
+          <w:szCs w:val="28"/>
+          <w:lang w:val="ru-RU"/>
+        </w:rPr>
+        <w:t xml:space="preserve"> — доступен для продажи; </w:t>
+      </w:r>
+      <w:r>
+        <w:rPr>
+          <w:rFonts w:cs="Times New Roman"/>
+          <w:sz w:val="28"/>
+          <w:szCs w:val="28"/>
+        </w:rPr>
+        <w:t>sold</w:t>
+      </w:r>
+      <w:r>
+        <w:rPr>
+          <w:rFonts w:cs="Times New Roman"/>
+          <w:sz w:val="28"/>
+          <w:szCs w:val="28"/>
+          <w:lang w:val="ru-RU"/>
+        </w:rPr>
+        <w:t xml:space="preserve"> — продан.</w:t>
       </w:r>
     </w:p>
     <w:p>
@@ -13549,13 +12203,7 @@
         </w:rPr>
       </w:pPr>
       <w:r>
-        <w:rPr>
-          <w:rFonts w:cs="Times New Roman"/>
-          <w:sz w:val="28"/>
-          <w:szCs w:val="28"/>
-          <w:lang w:val="ru-RU"/>
-        </w:rPr>
-        <w:t>Доход должен содержать уникальный идентификатор, идентификатор продажи, процент комиссии, сумму комиссии и дату создания.</w:t>
+        <w:t>Заявка содержит id, идентификаторы лота и покупателя, предложенную цену, статус pending / approved / rejected, дату создания и необязательную дату рассмотрения.</w:t>
       </w:r>
     </w:p>
     <w:p>
@@ -13568,13 +12216,26 @@
         </w:rPr>
       </w:pPr>
       <w:r>
-        <w:rPr>
-          <w:rFonts w:cs="Times New Roman"/>
-          <w:sz w:val="28"/>
-          <w:szCs w:val="28"/>
-          <w:lang w:val="ru-RU"/>
-        </w:rPr>
-        <w:t>Доход организатора рассчитывается на основании итоговой цены продажи и установленного процента комиссии.</w:t>
+        <w:t>Продажа содержит id, уникальный идентификатор лота, идентификатор покупателя, итоговую цену и время продажи. Доход содержит id, уникальный идентификатор продажи, ставку и сумму комиссии, дату создания.</w:t>
+      </w:r>
+    </w:p>
+    <w:p>
+      <w:pPr/>
+      <w:r>
+        <w:t>Схема данных и связи между восемью таблицами приведены в приложении 2 и README.md. Миграции 0001–0003 создают начальные сущности, учётные записи и заявки на покупку.</w:t>
+      </w:r>
+    </w:p>
+    <w:p>
+      <w:pPr>
+        <w:rPr>
+          <w:rFonts w:cs="Times New Roman"/>
+          <w:sz w:val="28"/>
+          <w:szCs w:val="28"/>
+          <w:lang w:val="ru-RU"/>
+        </w:rPr>
+      </w:pPr>
+      <w:r>
+        <w:t>Комиссия рассчитывается из цены продажи по COMMISSION_RATE и округляется до копеек.</w:t>
       </w:r>
     </w:p>
     <w:p>
@@ -13683,13 +12344,7 @@
         </w:rPr>
       </w:pPr>
       <w:r>
-        <w:rPr>
-          <w:rFonts w:cs="Times New Roman"/>
-          <w:sz w:val="28"/>
-          <w:szCs w:val="28"/>
-          <w:lang w:val="ru-RU"/>
-        </w:rPr>
-        <w:t>один аукцион содержит несколько лотов;</w:t>
+        <w:t>одна учётная запись может быть связана с одним профилем продавца либо покупателя;</w:t>
       </w:r>
     </w:p>
     <w:p>
@@ -13704,13 +12359,7 @@
         </w:rPr>
       </w:pPr>
       <w:r>
-        <w:rPr>
-          <w:rFonts w:cs="Times New Roman"/>
-          <w:sz w:val="28"/>
-          <w:szCs w:val="28"/>
-          <w:lang w:val="ru-RU"/>
-        </w:rPr>
-        <w:t>один продавец может выставить несколько лотов;</w:t>
+        <w:t>один аукцион содержит несколько лотов;</w:t>
       </w:r>
     </w:p>
     <w:p>
@@ -13725,13 +12374,7 @@
         </w:rPr>
       </w:pPr>
       <w:r>
-        <w:rPr>
-          <w:rFonts w:cs="Times New Roman"/>
-          <w:sz w:val="28"/>
-          <w:szCs w:val="28"/>
-          <w:lang w:val="ru-RU"/>
-        </w:rPr>
-        <w:t>каждый лот относится только к одному аукциону;</w:t>
+        <w:t>один продавец может выставить несколько лотов;</w:t>
       </w:r>
     </w:p>
     <w:p>
@@ -13746,13 +12389,7 @@
         </w:rPr>
       </w:pPr>
       <w:r>
-        <w:rPr>
-          <w:rFonts w:cs="Times New Roman"/>
-          <w:sz w:val="28"/>
-          <w:szCs w:val="28"/>
-          <w:lang w:val="ru-RU"/>
-        </w:rPr>
-        <w:t>каждый лот относится только к одному продавцу;</w:t>
+        <w:t>каждый лот относится к одному аукциону и одному продавцу;</w:t>
       </w:r>
     </w:p>
     <w:p>
@@ -13767,13 +12404,7 @@
         </w:rPr>
       </w:pPr>
       <w:r>
-        <w:rPr>
-          <w:rFonts w:cs="Times New Roman"/>
-          <w:sz w:val="28"/>
-          <w:szCs w:val="28"/>
-          <w:lang w:val="ru-RU"/>
-        </w:rPr>
-        <w:t>один покупатель может совершить несколько покупок;</w:t>
+        <w:t>один покупатель может отправить несколько заявок и совершить несколько покупок;</w:t>
       </w:r>
     </w:p>
     <w:p>
@@ -13788,13 +12419,7 @@
         </w:rPr>
       </w:pPr>
       <w:r>
-        <w:rPr>
-          <w:rFonts w:cs="Times New Roman"/>
-          <w:sz w:val="28"/>
-          <w:szCs w:val="28"/>
-          <w:lang w:val="ru-RU"/>
-        </w:rPr>
-        <w:t>одна продажа относится к одному лоту и одному покупателю;</w:t>
+        <w:t>один лот может получить несколько заявок, но не более одной продажи;</w:t>
       </w:r>
     </w:p>
     <w:p>
@@ -13809,13 +12434,7 @@
         </w:rPr>
       </w:pPr>
       <w:r>
-        <w:rPr>
-          <w:rFonts w:cs="Times New Roman"/>
-          <w:sz w:val="28"/>
-          <w:szCs w:val="28"/>
-          <w:lang w:val="ru-RU"/>
-        </w:rPr>
-        <w:t>одна продажа создает одну запись о доходе;</w:t>
+        <w:t>одна продажа относится к одному покупателю и создаёт одну запись о доходе;</w:t>
       </w:r>
     </w:p>
     <w:p>
@@ -13830,13 +12449,7 @@
         </w:rPr>
       </w:pPr>
       <w:r>
-        <w:rPr>
-          <w:rFonts w:cs="Times New Roman"/>
-          <w:sz w:val="28"/>
-          <w:szCs w:val="28"/>
-          <w:lang w:val="ru-RU"/>
-        </w:rPr>
-        <w:t>один лот может иметь не более одной продажи.</w:t>
+        <w:t>внешние ключи запрещают удаление связанных записей.</w:t>
       </w:r>
     </w:p>
     <w:p>
@@ -13904,13 +12517,7 @@
         </w:rPr>
       </w:pPr>
       <w:r>
-        <w:rPr>
-          <w:rFonts w:cs="Times New Roman"/>
-          <w:sz w:val="28"/>
-          <w:szCs w:val="28"/>
-          <w:lang w:val="ru-RU"/>
-        </w:rPr>
-        <w:t>Дата окончания аукциона должна быть позже даты начала.</w:t>
+        <w:t>Дата окончания аукциона позже начала; входные даты содержат часовой пояс.</w:t>
       </w:r>
     </w:p>
     <w:p>
@@ -13925,13 +12532,7 @@
         </w:rPr>
       </w:pPr>
       <w:r>
-        <w:rPr>
-          <w:rFonts w:cs="Times New Roman"/>
-          <w:sz w:val="28"/>
-          <w:szCs w:val="28"/>
-          <w:lang w:val="ru-RU"/>
-        </w:rPr>
-        <w:t>Начальная цена лота должна быть больше нуля.</w:t>
+        <w:t>Начальная цена лота и предложенная цена заявки больше нуля.</w:t>
       </w:r>
     </w:p>
     <w:p>
@@ -13946,13 +12547,7 @@
         </w:rPr>
       </w:pPr>
       <w:r>
-        <w:rPr>
-          <w:rFonts w:cs="Times New Roman"/>
-          <w:sz w:val="28"/>
-          <w:szCs w:val="28"/>
-          <w:lang w:val="ru-RU"/>
-        </w:rPr>
-        <w:t>Итоговая цена продажи должна быть не меньше начальной цены лота.</w:t>
+        <w:t>Цена заявки и итоговая цена продажи не ниже начальной цены лота.</w:t>
       </w:r>
     </w:p>
     <w:p>
@@ -13967,13 +12562,7 @@
         </w:rPr>
       </w:pPr>
       <w:r>
-        <w:rPr>
-          <w:rFonts w:cs="Times New Roman"/>
-          <w:sz w:val="28"/>
-          <w:szCs w:val="28"/>
-          <w:lang w:val="ru-RU"/>
-        </w:rPr>
-        <w:t>Один лот нельзя продать более одного раза.</w:t>
+        <w:t>Одновременно у лота не более одной заявки со статусом pending.</w:t>
       </w:r>
     </w:p>
     <w:p>
@@ -13988,13 +12577,7 @@
         </w:rPr>
       </w:pPr>
       <w:r>
-        <w:rPr>
-          <w:rFonts w:cs="Times New Roman"/>
-          <w:sz w:val="28"/>
-          <w:szCs w:val="28"/>
-          <w:lang w:val="ru-RU"/>
-        </w:rPr>
-        <w:t>Продать можно только существующий и доступный лот.</w:t>
+        <w:t>Продать можно только доступный существующий лот и не более одного раза.</w:t>
       </w:r>
     </w:p>
     <w:p>
@@ -14009,13 +12592,7 @@
         </w:rPr>
       </w:pPr>
       <w:r>
-        <w:rPr>
-          <w:rFonts w:cs="Times New Roman"/>
-          <w:sz w:val="28"/>
-          <w:szCs w:val="28"/>
-          <w:lang w:val="ru-RU"/>
-        </w:rPr>
-        <w:t>Продажа должна относиться к существующему покупателю.</w:t>
+        <w:t>Продажа и заявка относятся к существующему покупателю.</w:t>
       </w:r>
     </w:p>
     <w:p>
@@ -14030,13 +12607,7 @@
         </w:rPr>
       </w:pPr>
       <w:r>
-        <w:rPr>
-          <w:rFonts w:cs="Times New Roman"/>
-          <w:sz w:val="28"/>
-          <w:szCs w:val="28"/>
-          <w:lang w:val="ru-RU"/>
-        </w:rPr>
-        <w:t>Запись о продаже и соответствующая запись о доходе должны сохраняться в одной транзакции.</w:t>
+        <w:t>Подтверждение заявки атомарно создаёт продажу и доход, меняет статусы лота и заявки.</w:t>
       </w:r>
     </w:p>
     <w:p>
@@ -14051,13 +12622,7 @@
         </w:rPr>
       </w:pPr>
       <w:r>
-        <w:rPr>
-          <w:rFonts w:cs="Times New Roman"/>
-          <w:sz w:val="28"/>
-          <w:szCs w:val="28"/>
-          <w:lang w:val="ru-RU"/>
-        </w:rPr>
-        <w:t>Денежные значения должны храниться как точные десятичные числа, а не как числа с плавающей точкой.</w:t>
+        <w:t>Отклонённая заявка сохраняется, лот остаётся доступным; денежные суммы хранятся как Decimal.</w:t>
       </w:r>
     </w:p>
     <w:p>
@@ -14072,30 +12637,7 @@
         </w:rPr>
       </w:pPr>
       <w:r>
-        <w:rPr>
-          <w:rFonts w:cs="Times New Roman"/>
-          <w:sz w:val="28"/>
-          <w:szCs w:val="28"/>
-          <w:lang w:val="ru-RU"/>
-        </w:rPr>
-        <w:t xml:space="preserve">Даты и время должны храниться в часовом поясе </w:t>
-      </w:r>
-      <w:r>
-        <w:rPr>
-          <w:rFonts w:cs="Times New Roman"/>
-          <w:sz w:val="28"/>
-          <w:szCs w:val="28"/>
-        </w:rPr>
-        <w:t>UTC</w:t>
-      </w:r>
-      <w:r>
-        <w:rPr>
-          <w:rFonts w:cs="Times New Roman"/>
-          <w:sz w:val="28"/>
-          <w:szCs w:val="28"/>
-          <w:lang w:val="ru-RU"/>
-        </w:rPr>
-        <w:t>.</w:t>
+        <w:t>Временные отметки сохраняются с часовым поясом; даты аукционов приводятся к UTC.</w:t>
       </w:r>
     </w:p>
     <w:p>
@@ -14534,67 +13076,7 @@
         </w:rPr>
       </w:pPr>
       <w:r>
-        <w:rPr>
-          <w:rFonts w:cs="Times New Roman"/>
-          <w:sz w:val="28"/>
-          <w:szCs w:val="28"/>
-          <w:lang w:val="ru-RU"/>
-        </w:rPr>
-        <w:t xml:space="preserve">В конфигурации приложения предусмотрена переменная окружения </w:t>
-      </w:r>
-      <w:r>
-        <w:rPr>
-          <w:rFonts w:cs="Times New Roman"/>
-          <w:sz w:val="28"/>
-          <w:szCs w:val="28"/>
-        </w:rPr>
-        <w:t>LOG</w:t>
-      </w:r>
-      <w:r>
-        <w:rPr>
-          <w:rFonts w:cs="Times New Roman"/>
-          <w:sz w:val="28"/>
-          <w:szCs w:val="28"/>
-          <w:lang w:val="ru-RU"/>
-        </w:rPr>
-        <w:t>_</w:t>
-      </w:r>
-      <w:r>
-        <w:rPr>
-          <w:rFonts w:cs="Times New Roman"/>
-          <w:sz w:val="28"/>
-          <w:szCs w:val="28"/>
-        </w:rPr>
-        <w:t>LEVEL</w:t>
-      </w:r>
-      <w:r>
-        <w:rPr>
-          <w:rFonts w:cs="Times New Roman"/>
-          <w:sz w:val="28"/>
-          <w:szCs w:val="28"/>
-          <w:lang w:val="ru-RU"/>
-        </w:rPr>
-        <w:t xml:space="preserve"> — уровень </w:t>
-      </w:r>
-      <w:proofErr w:type="spellStart"/>
-      <w:r>
-        <w:rPr>
-          <w:rFonts w:cs="Times New Roman"/>
-          <w:sz w:val="28"/>
-          <w:szCs w:val="28"/>
-          <w:lang w:val="ru-RU"/>
-        </w:rPr>
-        <w:t>журналирования</w:t>
-      </w:r>
-      <w:proofErr w:type="spellEnd"/>
-      <w:r>
-        <w:rPr>
-          <w:rFonts w:cs="Times New Roman"/>
-          <w:sz w:val="28"/>
-          <w:szCs w:val="28"/>
-          <w:lang w:val="ru-RU"/>
-        </w:rPr>
-        <w:t>.</w:t>
+        <w:t>Переменная LOG_LEVEL считывается настройками, но отдельная настройка журналирования по ней сейчас не выполняется.</w:t>
       </w:r>
     </w:p>
     <w:p>
@@ -14631,100 +13113,7 @@
         </w:rPr>
       </w:pPr>
       <w:r>
-        <w:rPr>
-          <w:rFonts w:cs="Times New Roman"/>
-          <w:sz w:val="28"/>
-          <w:szCs w:val="28"/>
-          <w:lang w:val="ru-RU"/>
-        </w:rPr>
-        <w:t xml:space="preserve">Для запуска проекта необходимы </w:t>
-      </w:r>
-      <w:r>
-        <w:rPr>
-          <w:rFonts w:cs="Times New Roman"/>
-          <w:sz w:val="28"/>
-          <w:szCs w:val="28"/>
-        </w:rPr>
-        <w:t>Python</w:t>
-      </w:r>
-      <w:r>
-        <w:rPr>
-          <w:rFonts w:cs="Times New Roman"/>
-          <w:sz w:val="28"/>
-          <w:szCs w:val="28"/>
-          <w:lang w:val="ru-RU"/>
-        </w:rPr>
-        <w:t xml:space="preserve"> 3.12, </w:t>
-      </w:r>
-      <w:proofErr w:type="spellStart"/>
-      <w:r>
-        <w:rPr>
-          <w:rFonts w:cs="Times New Roman"/>
-          <w:sz w:val="28"/>
-          <w:szCs w:val="28"/>
-        </w:rPr>
-        <w:t>uv</w:t>
-      </w:r>
-      <w:proofErr w:type="spellEnd"/>
-      <w:r>
-        <w:rPr>
-          <w:rFonts w:cs="Times New Roman"/>
-          <w:sz w:val="28"/>
-          <w:szCs w:val="28"/>
-          <w:lang w:val="ru-RU"/>
-        </w:rPr>
-        <w:t xml:space="preserve">, </w:t>
-      </w:r>
-      <w:r>
-        <w:rPr>
-          <w:rFonts w:cs="Times New Roman"/>
-          <w:sz w:val="28"/>
-          <w:szCs w:val="28"/>
-        </w:rPr>
-        <w:t>GNU</w:t>
-      </w:r>
-      <w:r>
-        <w:rPr>
-          <w:rFonts w:cs="Times New Roman"/>
-          <w:sz w:val="28"/>
-          <w:szCs w:val="28"/>
-          <w:lang w:val="ru-RU"/>
-        </w:rPr>
-        <w:t xml:space="preserve"> </w:t>
-      </w:r>
-      <w:r>
-        <w:rPr>
-          <w:rFonts w:cs="Times New Roman"/>
-          <w:sz w:val="28"/>
-          <w:szCs w:val="28"/>
-        </w:rPr>
-        <w:t>Make</w:t>
-      </w:r>
-      <w:r>
-        <w:rPr>
-          <w:rFonts w:cs="Times New Roman"/>
-          <w:sz w:val="28"/>
-          <w:szCs w:val="28"/>
-          <w:lang w:val="ru-RU"/>
-        </w:rPr>
-        <w:t xml:space="preserve"> и </w:t>
-      </w:r>
-      <w:r>
-        <w:rPr>
-          <w:rFonts w:cs="Times New Roman"/>
-          <w:sz w:val="28"/>
-          <w:szCs w:val="28"/>
-        </w:rPr>
-        <w:t>PostgreSQL</w:t>
-      </w:r>
-      <w:r>
-        <w:rPr>
-          <w:rFonts w:cs="Times New Roman"/>
-          <w:sz w:val="28"/>
-          <w:szCs w:val="28"/>
-          <w:lang w:val="ru-RU"/>
-        </w:rPr>
-        <w:t>.</w:t>
+        <w:t>Для запуска необходимы Python 3.12, PostgreSQL от 14, uv от 0.10.7 и GNU Make. make setup использует Python 3.12.</w:t>
       </w:r>
     </w:p>
     <w:p>
@@ -15571,47 +13960,7 @@
         </w:rPr>
       </w:pPr>
       <w:r>
-        <w:rPr>
-          <w:rFonts w:cs="Times New Roman"/>
-          <w:sz w:val="28"/>
-          <w:szCs w:val="28"/>
-          <w:lang w:val="ru-RU"/>
-        </w:rPr>
-        <w:t xml:space="preserve">реализация </w:t>
-      </w:r>
-      <w:r>
-        <w:rPr>
-          <w:rFonts w:cs="Times New Roman"/>
-          <w:sz w:val="28"/>
-          <w:szCs w:val="28"/>
-        </w:rPr>
-        <w:t>HTTP</w:t>
-      </w:r>
-      <w:r>
-        <w:rPr>
-          <w:rFonts w:cs="Times New Roman"/>
-          <w:sz w:val="28"/>
-          <w:szCs w:val="28"/>
-          <w:lang w:val="ru-RU"/>
-        </w:rPr>
-        <w:t xml:space="preserve"> </w:t>
-      </w:r>
-      <w:r>
-        <w:rPr>
-          <w:rFonts w:cs="Times New Roman"/>
-          <w:sz w:val="28"/>
-          <w:szCs w:val="28"/>
-        </w:rPr>
-        <w:t>API</w:t>
-      </w:r>
-      <w:r>
-        <w:rPr>
-          <w:rFonts w:cs="Times New Roman"/>
-          <w:sz w:val="28"/>
-          <w:szCs w:val="28"/>
-          <w:lang w:val="ru-RU"/>
-        </w:rPr>
-        <w:t xml:space="preserve"> для продавцов и покупателей;</w:t>
+        <w:t>реализация веб-страниц входа и кабинета пользователей;</w:t>
       </w:r>
     </w:p>
     <w:p>
@@ -15626,47 +13975,7 @@
         </w:rPr>
       </w:pPr>
       <w:r>
-        <w:rPr>
-          <w:rFonts w:cs="Times New Roman"/>
-          <w:sz w:val="28"/>
-          <w:szCs w:val="28"/>
-          <w:lang w:val="ru-RU"/>
-        </w:rPr>
-        <w:t xml:space="preserve">реализация </w:t>
-      </w:r>
-      <w:r>
-        <w:rPr>
-          <w:rFonts w:cs="Times New Roman"/>
-          <w:sz w:val="28"/>
-          <w:szCs w:val="28"/>
-        </w:rPr>
-        <w:t>HTTP</w:t>
-      </w:r>
-      <w:r>
-        <w:rPr>
-          <w:rFonts w:cs="Times New Roman"/>
-          <w:sz w:val="28"/>
-          <w:szCs w:val="28"/>
-          <w:lang w:val="ru-RU"/>
-        </w:rPr>
-        <w:t xml:space="preserve"> </w:t>
-      </w:r>
-      <w:r>
-        <w:rPr>
-          <w:rFonts w:cs="Times New Roman"/>
-          <w:sz w:val="28"/>
-          <w:szCs w:val="28"/>
-        </w:rPr>
-        <w:t>API</w:t>
-      </w:r>
-      <w:r>
-        <w:rPr>
-          <w:rFonts w:cs="Times New Roman"/>
-          <w:sz w:val="28"/>
-          <w:szCs w:val="28"/>
-          <w:lang w:val="ru-RU"/>
-        </w:rPr>
-        <w:t xml:space="preserve"> для аукционов;</w:t>
+        <w:t>реализация учётных записей, сессий и разграничения ролей в кабинете;</w:t>
       </w:r>
     </w:p>
     <w:p>
@@ -15681,47 +13990,7 @@
         </w:rPr>
       </w:pPr>
       <w:r>
-        <w:rPr>
-          <w:rFonts w:cs="Times New Roman"/>
-          <w:sz w:val="28"/>
-          <w:szCs w:val="28"/>
-          <w:lang w:val="ru-RU"/>
-        </w:rPr>
-        <w:t xml:space="preserve">реализация </w:t>
-      </w:r>
-      <w:r>
-        <w:rPr>
-          <w:rFonts w:cs="Times New Roman"/>
-          <w:sz w:val="28"/>
-          <w:szCs w:val="28"/>
-        </w:rPr>
-        <w:t>HTTP</w:t>
-      </w:r>
-      <w:r>
-        <w:rPr>
-          <w:rFonts w:cs="Times New Roman"/>
-          <w:sz w:val="28"/>
-          <w:szCs w:val="28"/>
-          <w:lang w:val="ru-RU"/>
-        </w:rPr>
-        <w:t xml:space="preserve"> </w:t>
-      </w:r>
-      <w:r>
-        <w:rPr>
-          <w:rFonts w:cs="Times New Roman"/>
-          <w:sz w:val="28"/>
-          <w:szCs w:val="28"/>
-        </w:rPr>
-        <w:t>API</w:t>
-      </w:r>
-      <w:r>
-        <w:rPr>
-          <w:rFonts w:cs="Times New Roman"/>
-          <w:sz w:val="28"/>
-          <w:szCs w:val="28"/>
-          <w:lang w:val="ru-RU"/>
-        </w:rPr>
-        <w:t xml:space="preserve"> для лотов;</w:t>
+        <w:t>реализация аукционов, участников и лотов;</w:t>
       </w:r>
     </w:p>
     <w:p>
@@ -15734,59 +14003,8 @@
           <w:szCs w:val="28"/>
         </w:rPr>
       </w:pPr>
-      <w:proofErr w:type="spellStart"/>
-      <w:r>
-        <w:rPr>
-          <w:rFonts w:cs="Times New Roman"/>
-          <w:sz w:val="28"/>
-          <w:szCs w:val="28"/>
-        </w:rPr>
-        <w:t>реализация</w:t>
-      </w:r>
-      <w:proofErr w:type="spellEnd"/>
-      <w:r>
-        <w:rPr>
-          <w:rFonts w:cs="Times New Roman"/>
-          <w:sz w:val="28"/>
-          <w:szCs w:val="28"/>
-        </w:rPr>
-        <w:t xml:space="preserve"> </w:t>
-      </w:r>
-      <w:proofErr w:type="spellStart"/>
-      <w:r>
-        <w:rPr>
-          <w:rFonts w:cs="Times New Roman"/>
-          <w:sz w:val="28"/>
-          <w:szCs w:val="28"/>
-        </w:rPr>
-        <w:t>регистрации</w:t>
-      </w:r>
-      <w:proofErr w:type="spellEnd"/>
-      <w:r>
-        <w:rPr>
-          <w:rFonts w:cs="Times New Roman"/>
-          <w:sz w:val="28"/>
-          <w:szCs w:val="28"/>
-        </w:rPr>
-        <w:t xml:space="preserve"> </w:t>
-      </w:r>
-      <w:proofErr w:type="spellStart"/>
-      <w:r>
-        <w:rPr>
-          <w:rFonts w:cs="Times New Roman"/>
-          <w:sz w:val="28"/>
-          <w:szCs w:val="28"/>
-        </w:rPr>
-        <w:t>продаж</w:t>
-      </w:r>
-      <w:proofErr w:type="spellEnd"/>
-      <w:r>
-        <w:rPr>
-          <w:rFonts w:cs="Times New Roman"/>
-          <w:sz w:val="28"/>
-          <w:szCs w:val="28"/>
-        </w:rPr>
-        <w:t>;</w:t>
+      <w:r>
+        <w:t>реализация подачи и рассмотрения заявок на покупку;</w:t>
       </w:r>
     </w:p>
     <w:p>
@@ -15801,13 +14019,7 @@
         </w:rPr>
       </w:pPr>
       <w:r>
-        <w:rPr>
-          <w:rFonts w:cs="Times New Roman"/>
-          <w:sz w:val="28"/>
-          <w:szCs w:val="28"/>
-          <w:lang w:val="ru-RU"/>
-        </w:rPr>
-        <w:t>реализация расчета и получения доходов организатора;</w:t>
+        <w:t>реализация продаж и расчёта доходов организатора;</w:t>
       </w:r>
     </w:p>
     <w:p>
@@ -16465,47 +14677,7 @@
         </w:rPr>
       </w:pPr>
       <w:r>
-        <w:rPr>
-          <w:rFonts w:cs="Times New Roman"/>
-          <w:sz w:val="28"/>
-          <w:szCs w:val="28"/>
-          <w:lang w:val="ru-RU"/>
-        </w:rPr>
-        <w:t xml:space="preserve">Опытная эксплуатация проводится после успешного прохождения предварительных испытаний. В ходе опытной эксплуатации проверяются основные функции </w:t>
-      </w:r>
-      <w:r>
-        <w:rPr>
-          <w:rFonts w:cs="Times New Roman"/>
-          <w:sz w:val="28"/>
-          <w:szCs w:val="28"/>
-        </w:rPr>
-        <w:t>HTTP</w:t>
-      </w:r>
-      <w:r>
-        <w:rPr>
-          <w:rFonts w:cs="Times New Roman"/>
-          <w:sz w:val="28"/>
-          <w:szCs w:val="28"/>
-          <w:lang w:val="ru-RU"/>
-        </w:rPr>
-        <w:t xml:space="preserve"> </w:t>
-      </w:r>
-      <w:r>
-        <w:rPr>
-          <w:rFonts w:cs="Times New Roman"/>
-          <w:sz w:val="28"/>
-          <w:szCs w:val="28"/>
-        </w:rPr>
-        <w:t>API</w:t>
-      </w:r>
-      <w:r>
-        <w:rPr>
-          <w:rFonts w:cs="Times New Roman"/>
-          <w:sz w:val="28"/>
-          <w:szCs w:val="28"/>
-          <w:lang w:val="ru-RU"/>
-        </w:rPr>
-        <w:t>, корректность операций с базой данных, регистрация продаж и расчет дохода организатора. Выявленные замечания фиксируются и устраняются до приемочных испытаний.</w:t>
+        <w:t>Опытная эксплуатация проверяет вход и роли, создание аукциона и лота, подачу, подтверждение и отклонение заявки, появление продажи и дохода после подтверждения.</w:t>
       </w:r>
     </w:p>
     <w:p>
@@ -16518,57 +14690,7 @@
         </w:rPr>
       </w:pPr>
       <w:r>
-        <w:rPr>
-          <w:rFonts w:cs="Times New Roman"/>
-          <w:sz w:val="28"/>
-          <w:szCs w:val="28"/>
-          <w:lang w:val="ru-RU"/>
-        </w:rPr>
-        <w:t xml:space="preserve">Опытная эксплуатация проводится после успешного прохождения предварительных испытаний. В ходе опытной эксплуатации проверяются основные функции </w:t>
-      </w:r>
-      <w:r>
-        <w:rPr>
-          <w:rFonts w:cs="Times New Roman"/>
-          <w:sz w:val="28"/>
-          <w:szCs w:val="28"/>
-        </w:rPr>
-        <w:t>HTTP</w:t>
-      </w:r>
-      <w:r>
-        <w:rPr>
-          <w:rFonts w:cs="Times New Roman"/>
-          <w:sz w:val="28"/>
-          <w:szCs w:val="28"/>
-          <w:lang w:val="ru-RU"/>
-        </w:rPr>
-        <w:t xml:space="preserve"> </w:t>
-      </w:r>
-      <w:r>
-        <w:rPr>
-          <w:rFonts w:cs="Times New Roman"/>
-          <w:sz w:val="28"/>
-          <w:szCs w:val="28"/>
-        </w:rPr>
-        <w:t>API</w:t>
-      </w:r>
-      <w:r>
-        <w:rPr>
-          <w:rFonts w:cs="Times New Roman"/>
-          <w:sz w:val="28"/>
-          <w:szCs w:val="28"/>
-          <w:lang w:val="ru-RU"/>
-        </w:rPr>
-        <w:t xml:space="preserve">, корректность операций с базой данных, </w:t>
-      </w:r>
-      <w:r>
-        <w:rPr>
-          <w:rFonts w:cs="Times New Roman"/>
-          <w:sz w:val="28"/>
-          <w:szCs w:val="28"/>
-          <w:lang w:val="ru-RU"/>
-        </w:rPr>
-        <w:lastRenderedPageBreak/>
-        <w:t>регистрация продаж и расчет дохода организатора. Выявленные замечания фиксируются и устраняются до приемочных испытаний.</w:t>
+        <w:t>Проверяются также доступность HTTP API, работа с PostgreSQL и корректность миграций.</w:t>
       </w:r>
     </w:p>
     <w:p>
@@ -16682,13 +14804,7 @@
         </w:rPr>
       </w:pPr>
       <w:r>
-        <w:rPr>
-          <w:rFonts w:cs="Times New Roman"/>
-          <w:sz w:val="28"/>
-          <w:szCs w:val="28"/>
-          <w:lang w:val="ru-RU"/>
-        </w:rPr>
-        <w:t>Комплексные приемочные испытания проводятся после завершения опытной эксплуатации и включают проверку совместной работы функций системы: работы с продавцами, покупателями, аукционами, лотами, продажами и доходами организатора. Результатом является протокол испытаний с указанием выявленных замечаний и их статуса.</w:t>
+        <w:t>Комплексные испытания охватывают совместную работу веб-интерфейса, учётных записей, участников, аукционов, лотов, заявок, продаж и доходов. Результат оформляется протоколом.</w:t>
       </w:r>
     </w:p>
     <w:p>
@@ -18436,6 +16552,72 @@
           </w:p>
         </w:tc>
       </w:tr>
+      <w:tr>
+        <w:tc>
+          <w:tcPr>
+            <w:tcW w:type="dxa" w:w="4839"/>
+          </w:tcPr>
+          <w:p>
+            <w:r>
+              <w:t>Учётная запись</w:t>
+            </w:r>
+          </w:p>
+        </w:tc>
+        <w:tc>
+          <w:tcPr>
+            <w:tcW w:type="dxa" w:w="4840"/>
+          </w:tcPr>
+          <w:p>
+            <w:r>
+              <w:t>Логин, хеш пароля, роль и необязательная связь с профилем участника.</w:t>
+            </w:r>
+          </w:p>
+        </w:tc>
+      </w:tr>
+      <w:tr>
+        <w:tc>
+          <w:tcPr>
+            <w:tcW w:type="dxa" w:w="4839"/>
+          </w:tcPr>
+          <w:p>
+            <w:r>
+              <w:t>Заявка на покупку</w:t>
+            </w:r>
+          </w:p>
+        </w:tc>
+        <w:tc>
+          <w:tcPr>
+            <w:tcW w:type="dxa" w:w="4840"/>
+          </w:tcPr>
+          <w:p>
+            <w:r>
+              <w:t>Предложение покупателя по лоту со статусом pending, approved или rejected.</w:t>
+            </w:r>
+          </w:p>
+        </w:tc>
+      </w:tr>
+      <w:tr>
+        <w:tc>
+          <w:tcPr>
+            <w:tcW w:type="dxa" w:w="4839"/>
+          </w:tcPr>
+          <w:p>
+            <w:r>
+              <w:t>Веб-кабинет</w:t>
+            </w:r>
+          </w:p>
+        </w:tc>
+        <w:tc>
+          <w:tcPr>
+            <w:tcW w:type="dxa" w:w="4840"/>
+          </w:tcPr>
+          <w:p>
+            <w:r>
+              <w:t>Пользовательские страницы /login и /app с функциями по роли.</w:t>
+            </w:r>
+          </w:p>
+        </w:tc>
+      </w:tr>
     </w:tbl>
     <w:p>
       <w:pPr>
@@ -18447,13 +16629,89 @@
       </w:pPr>
     </w:p>
     <w:p/>
+    <w:p>
+      <w:pPr>
+        <w:sectPr>
+          <w:footerReference w:type="default" r:id="rId7"/>
+          <w:footerReference w:type="first" r:id="rId8"/>
+          <w:pgSz w:w="12240" w:h="15840"/>
+          <w:pgMar w:top="1134" w:right="850" w:bottom="1134" w:left="1701" w:header="720" w:footer="720" w:gutter="0"/>
+          <w:cols w:space="720"/>
+          <w:titlePg/>
+          <w:docGrid w:linePitch="360"/>
+        </w:sectPr>
+      </w:pPr>
+    </w:p>
+    <w:p>
+      <w:pPr>
+        <w:pStyle w:val="1"/>
+        <w:spacing w:after="40"/>
+      </w:pPr>
+      <w:bookmarkStart w:id="900" w:name="_TocSchemaDatabase"/>
+      <w:bookmarkEnd w:id="900"/>
+      <w:r>
+        <w:rPr>
+          <w:color w:val="000000"/>
+        </w:rPr>
+        <w:t>ПРИЛОЖЕНИЕ 2</w:t>
+      </w:r>
+    </w:p>
+    <w:p>
+      <w:pPr>
+        <w:pStyle w:val="21"/>
+        <w:spacing w:after="80"/>
+      </w:pPr>
+      <w:r>
+        <w:rPr>
+          <w:color w:val="000000"/>
+        </w:rPr>
+        <w:t>СХЕМА БАЗЫ ДАННЫХ</w:t>
+      </w:r>
+    </w:p>
+    <w:p>
+      <w:pPr>
+        <w:spacing w:before="0" w:after="0"/>
+        <w:jc w:val="center"/>
+      </w:pPr>
+      <w:r>
+        <w:drawing>
+          <wp:inline xmlns:a="http://schemas.openxmlformats.org/drawingml/2006/main" xmlns:pic="http://schemas.openxmlformats.org/drawingml/2006/picture">
+            <wp:extent cx="8503920" cy="5770517"/>
+            <wp:docPr id="1" name="Picture 1"/>
+            <wp:cNvGraphicFramePr>
+              <a:graphicFrameLocks noChangeAspect="1"/>
+            </wp:cNvGraphicFramePr>
+            <a:graphic>
+              <a:graphicData uri="http://schemas.openxmlformats.org/drawingml/2006/picture">
+                <pic:pic>
+                  <pic:nvPicPr>
+                    <pic:cNvPr id="0" name="auctions-schema.png"/>
+                    <pic:cNvPicPr/>
+                  </pic:nvPicPr>
+                  <pic:blipFill>
+                    <a:blip r:embed="rId11"/>
+                    <a:stretch>
+                      <a:fillRect/>
+                    </a:stretch>
+                  </pic:blipFill>
+                  <pic:spPr>
+                    <a:xfrm>
+                      <a:off x="0" y="0"/>
+                      <a:ext cx="8503920" cy="5770517"/>
+                    </a:xfrm>
+                    <a:prstGeom prst="rect"/>
+                  </pic:spPr>
+                </pic:pic>
+              </a:graphicData>
+            </a:graphic>
+          </wp:inline>
+        </w:drawing>
+      </w:r>
+    </w:p>
     <w:sectPr>
-      <w:footerReference w:type="default" r:id="rId7"/>
-      <w:footerReference w:type="first" r:id="rId8"/>
-      <w:pgSz w:w="12240" w:h="15840"/>
-      <w:pgMar w:top="1134" w:right="850" w:bottom="1134" w:left="1701" w:header="720" w:footer="720" w:gutter="0"/>
+      <w:pgSz w:w="15840" w:h="12240" w:orient="landscape"/>
+      <w:pgMar w:top="792" w:right="864" w:bottom="648" w:left="864" w:header="360" w:footer="360" w:gutter="0"/>
       <w:cols w:space="720"/>
-      <w:titlePg/>
       <w:docGrid w:linePitch="360"/>
     </w:sectPr>
   </w:body>

</xml_diff>

<commit_message>
docs: draw database relationships
</commit_message>
<xml_diff>
--- a/docs/Technical-Documentation.docx
+++ b/docs/Technical-Documentation.docx
@@ -16676,7 +16676,7 @@
       <w:r>
         <w:drawing>
           <wp:inline xmlns:a="http://schemas.openxmlformats.org/drawingml/2006/main" xmlns:pic="http://schemas.openxmlformats.org/drawingml/2006/picture">
-            <wp:extent cx="8503920" cy="5770517"/>
+            <wp:extent cx="8549640" cy="5052060"/>
             <wp:docPr id="1" name="Picture 1"/>
             <wp:cNvGraphicFramePr>
               <a:graphicFrameLocks noChangeAspect="1"/>
@@ -16685,11 +16685,11 @@
               <a:graphicData uri="http://schemas.openxmlformats.org/drawingml/2006/picture">
                 <pic:pic>
                   <pic:nvPicPr>
-                    <pic:cNvPr id="0" name="auctions-schema.png"/>
+                    <pic:cNvPr id="0" name="auctions-er-lines.png"/>
                     <pic:cNvPicPr/>
                   </pic:nvPicPr>
                   <pic:blipFill>
-                    <a:blip r:embed="rId11"/>
+                    <a:blip r:embed="rId12"/>
                     <a:stretch>
                       <a:fillRect/>
                     </a:stretch>
@@ -16697,7 +16697,7 @@
                   <pic:spPr>
                     <a:xfrm>
                       <a:off x="0" y="0"/>
-                      <a:ext cx="8503920" cy="5770517"/>
+                      <a:ext cx="8549640" cy="5052060"/>
                     </a:xfrm>
                     <a:prstGeom prst="rect"/>
                   </pic:spPr>

</xml_diff>